<commit_message>
feat(cip,warehouse,wms): CIP module, dây chuyền identification, Xuất kho location gating
- Thêm module CIP (Danh mục, Khai báo, Lịch sử) đầy đủ: biểu mẫu, thiết bị, gắn CIP vào
  mẻ nấu/lô lên men/mẻ lọc/mã chiết, tiêu chuẩn khoá vs thực tế, in báo cáo spec-vs-actual.
- Thêm mã nhận dạng dây chuyền (ProductionLine.identification_code) + mã nhà máy
  (OpsSetting.factory_code) phục vụ truy xuất nguồn gốc ngoài thị trường.
- Sửa graph alembic 2 head (CIP + CA-value) bằng merge migration.
- Xuất kho (Kho TP): gate chọn xuất theo hàng đã cất vị trí, chỉ bật ô Cận date khi lô có
  hàng cận date thật, thêm cột Vị trí kho ở giỏ hàng, hiện "Từ kho" + cận date ở lịch sử.
- Mẫu in Biên bản bàn giao: chỉ in dòng có số lượng.
- Sắp xếp lại nút Khóa lô/Chỉ tiêu ở các bảng Nấu/Lên men/Lọc/Chiết cho dễ thao tác.

Co-Authored-By: Claude Sonnet 5 <noreply@anthropic.com>
</commit_message>
<xml_diff>
--- a/docs/01-KIEN-TRUC-CHUAN.docx
+++ b/docs/01-KIEN-TRUC-CHUAN.docx
@@ -45,18 +45,6 @@
         <w:t>Tài liệu Kiến trúc Chuẩn</w:t>
       </w:r>
     </w:p>
-    <w:p>
-      <w:pPr>
-        <w:jc w:val="center"/>
-      </w:pPr>
-      <w:r>
-        <w:rPr>
-          <w:color w:val="555555"/>
-          <w:sz w:val="26"/>
-        </w:rPr>
-        <w:t>MES Bia Hạ Long - Nhà Máy Đông Mai</w:t>
-      </w:r>
-    </w:p>
     <w:p/>
     <w:p/>
     <w:p/>
@@ -108,7 +96,7 @@
           <w:color w:val="555555"/>
           <w:sz w:val="21"/>
         </w:rPr>
-        <w:t>Ngày cập nhật: 23/07/2026</w:t>
+        <w:t>Ngày cập nhật: 25/07/2026</w:t>
       </w:r>
     </w:p>
     <w:p>
@@ -8426,13 +8414,26 @@
                 <w:b/>
                 <w:sz w:val="18"/>
               </w:rPr>
-              <w:t>Đơn vị thành phẩm</w:t>
-            </w:r>
-            <w:r>
-              <w:rPr>
-                <w:sz w:val="18"/>
-              </w:rPr>
-              <w:t xml:space="preserve"> (thay thế hoàn toàn Pallet/Case/ShipmentLine cũ) — theo dõi từng đơn vị/lô, </w:t>
+              <w:t>Đơn vị LÔ thành phẩm</w:t>
+            </w:r>
+            <w:r>
+              <w:rPr>
+                <w:sz w:val="18"/>
+              </w:rPr>
+              <w:t xml:space="preserve"> (thay thế hoàn toàn Pallet/Case/ShipmentLine cũ) — thiết kế lại theo LÔ (2026-07): mỗi dòng đại diện </w:t>
+            </w:r>
+            <w:r>
+              <w:rPr>
+                <w:b/>
+                <w:sz w:val="18"/>
+              </w:rPr>
+              <w:t>1 lô</w:t>
+            </w:r>
+            <w:r>
+              <w:rPr>
+                <w:sz w:val="18"/>
+              </w:rPr>
+              <w:t xml:space="preserve"> (không còn 1 dòng/vỉ), </w:t>
             </w:r>
             <w:r>
               <w:rPr>
@@ -8440,13 +8441,96 @@
                 <w:color w:val="B03A2E"/>
                 <w:sz w:val="19"/>
               </w:rPr>
+              <w:t>quantity</w:t>
+            </w:r>
+            <w:r>
+              <w:rPr>
+                <w:sz w:val="18"/>
+              </w:rPr>
+              <w:t xml:space="preserve"> = tổng SL nhỏ (lon/keg) của cả lô, nên duyệt chiết luôn ra ĐÚNG 1 dòng bất kể quy mô (fix scale-bomb: lô 190.000 vỉ trước đây tạo ~190.000 dòng, treo nút Duyệt trên SQL Server). Xuất/phân rã (decompose)/điều chuyển (relocate)/xuất tự do MỘT PHẦN sẽ </w:t>
+            </w:r>
+            <w:r>
+              <w:rPr>
+                <w:b/>
+                <w:sz w:val="18"/>
+              </w:rPr>
+              <w:t>tách dòng</w:t>
+            </w:r>
+            <w:r>
+              <w:rPr>
+                <w:sz w:val="18"/>
+              </w:rPr>
+              <w:t xml:space="preserve"> theo FIFO (</w:t>
+            </w:r>
+            <w:r>
+              <w:rPr>
+                <w:rFonts w:ascii="Consolas" w:hAnsi="Consolas"/>
+                <w:color w:val="B03A2E"/>
+                <w:sz w:val="19"/>
+              </w:rPr>
+              <w:t>_consume_lot_rows</w:t>
+            </w:r>
+            <w:r>
+              <w:rPr>
+                <w:sz w:val="18"/>
+              </w:rPr>
+              <w:t xml:space="preserve">) — dòng mới mang đúng phần đã xử lý, dòng gốc giữ phần dư — thay vì chọn/xóa từng vỉ; </w:t>
+            </w:r>
+            <w:r>
+              <w:rPr>
+                <w:rFonts w:ascii="Consolas" w:hAnsi="Consolas"/>
+                <w:color w:val="B03A2E"/>
+                <w:sz w:val="19"/>
+              </w:rPr>
+              <w:t>pack_size</w:t>
+            </w:r>
+            <w:r>
+              <w:rPr>
+                <w:sz w:val="18"/>
+              </w:rPr>
+              <w:t xml:space="preserve"> (khai báo ở Danh mục Sản phẩm) chỉ dùng ở tầng đọc để quy đổi </w:t>
+            </w:r>
+            <w:r>
+              <w:rPr>
+                <w:rFonts w:ascii="Consolas" w:hAnsi="Consolas"/>
+                <w:color w:val="B03A2E"/>
+                <w:sz w:val="19"/>
+              </w:rPr>
+              <w:t>quantity</w:t>
+            </w:r>
+            <w:r>
+              <w:rPr>
+                <w:sz w:val="18"/>
+              </w:rPr>
+              <w:t xml:space="preserve"> ra số vỉ/keg hiển thị. Còn </w:t>
+            </w:r>
+            <w:r>
+              <w:rPr>
+                <w:rFonts w:ascii="Consolas" w:hAnsi="Consolas"/>
+                <w:color w:val="B03A2E"/>
+                <w:sz w:val="19"/>
+              </w:rPr>
               <w:t>is_near_expiry</w:t>
             </w:r>
             <w:r>
               <w:rPr>
                 <w:sz w:val="18"/>
               </w:rPr>
-              <w:t>, phân rã (decompose)/gộp (relocate) theo lô</w:t>
+              <w:t xml:space="preserve"> cho bia cận date. Xem </w:t>
+            </w:r>
+            <w:r>
+              <w:rPr>
+                <w:rFonts w:ascii="Consolas" w:hAnsi="Consolas"/>
+                <w:color w:val="B03A2E"/>
+                <w:sz w:val="19"/>
+              </w:rPr>
+              <w:t>docs/WMS-LOT-LEVEL-REDESIGN.md</w:t>
+            </w:r>
+            <w:r>
+              <w:rPr>
+                <w:sz w:val="18"/>
+              </w:rPr>
+              <w:t>.</w:t>
             </w:r>
           </w:p>
         </w:tc>

</xml_diff>

<commit_message>
feat(recipes): thay Recipe/RecipeVersion bằng Formula — bỏ version hóa, hỗ trợ nhiều công thức/1 dịch bia
Định nghĩa lại Công thức: mỗi dịch bia có nhiều công thức độc lập (không version hóa),
chỉ đúng 1 công thức hiệu lực tại 1 thời điểm, kích hoạt/khóa/lịch sử kích hoạt (tối đa
3 dòng/1 dịch bia). Lệnh nấu tự nạp NVL theo công thức hiệu lực — định mức là NGUYÊN VĂN
số lượng khai báo cho 1 mẻ (không scale theo sản lượng kế hoạch), nhân trực tiếp với số
mẻ kế hoạch. Giữ nguyên Recipe/RecipeVersion cũ cho "Công thức+"/e-signature, tự động
chuyển đổi dữ liệu recipe_version đang effective sang Formula qua migration.

Kèm theo: tính năng Bia gửi (consigned) mirror Bia cận date, báo cáo Xuất ròng theo kỳ,
và các cập nhật tài liệu/migration liên quan.
</commit_message>
<xml_diff>
--- a/docs/01-KIEN-TRUC-CHUAN.docx
+++ b/docs/01-KIEN-TRUC-CHUAN.docx
@@ -237,7 +237,7 @@
         <w:t>Ngày cập nhật:</w:t>
       </w:r>
       <w:r>
-        <w:t xml:space="preserve"> 23/07/2026</w:t>
+        <w:t xml:space="preserve"> 31/07/2026</w:t>
       </w:r>
     </w:p>
     <w:p>
@@ -995,7 +995,7 @@
           <w:color w:val="333333"/>
           <w:sz w:val="17"/>
         </w:rPr>
-        <w:t>│  ROUTERS (REST endpoints) — 32 router, ~379 endpoint                  │</w:t>
+        <w:t>│  ROUTERS (REST endpoints) — 33 router, ~397 endpoint                  │</w:t>
       </w:r>
       <w:r>
         <w:br/>
@@ -1061,7 +1061,7 @@
           <w:color w:val="333333"/>
           <w:sz w:val="17"/>
         </w:rPr>
-        <w:t>└───────────────┬──────────────────────────────────────────────────────┘</w:t>
+        <w:t>│  cip                                                                  │</w:t>
       </w:r>
       <w:r>
         <w:br/>
@@ -1072,7 +1072,7 @@
           <w:color w:val="333333"/>
           <w:sz w:val="17"/>
         </w:rPr>
-        <w:t>┌───────────────▼──────────────────────────────────────────────────────┐</w:t>
+        <w:t>└───────────────┬──────────────────────────────────────────────────────┘</w:t>
       </w:r>
       <w:r>
         <w:br/>
@@ -1083,7 +1083,7 @@
           <w:color w:val="333333"/>
           <w:sz w:val="17"/>
         </w:rPr>
-        <w:t>│  SERVICES (quy tắc nghiệp vụ) — 47 module                              │</w:t>
+        <w:t>┌───────────────▼──────────────────────────────────────────────────────┐</w:t>
       </w:r>
       <w:r>
         <w:br/>
@@ -1094,7 +1094,7 @@
           <w:color w:val="333333"/>
           <w:sz w:val="17"/>
         </w:rPr>
-        <w:t>│  batches · recipes · workorders · isa88 · genealogy · bom · dispense  │</w:t>
+        <w:t>│  SERVICES (quy tắc nghiệp vụ) — 48 module                              │</w:t>
       </w:r>
       <w:r>
         <w:br/>
@@ -1105,7 +1105,7 @@
           <w:color w:val="333333"/>
           <w:sz w:val="17"/>
         </w:rPr>
-        <w:t>│  warehouse · quality · quality_adv · qc_catalog · ebr · yield_calc    │</w:t>
+        <w:t>│  batches · recipes · workorders · isa88 · genealogy · bom · dispense  │</w:t>
       </w:r>
       <w:r>
         <w:br/>
@@ -1116,7 +1116,7 @@
           <w:color w:val="333333"/>
           <w:sz w:val="17"/>
         </w:rPr>
-        <w:t>│  downtime · performance · scheduler · historian · wms · packaging     │</w:t>
+        <w:t>│  warehouse · quality · quality_adv · qc_catalog · ebr · yield_calc    │</w:t>
       </w:r>
       <w:r>
         <w:br/>
@@ -1127,7 +1127,7 @@
           <w:color w:val="333333"/>
           <w:sz w:val="17"/>
         </w:rPr>
-        <w:t>│  brew_order · filter_order · lot_lock · lot_record · load_slip        │</w:t>
+        <w:t>│  downtime · performance · scheduler · historian · wms · packaging     │</w:t>
       </w:r>
       <w:r>
         <w:br/>
@@ -1138,7 +1138,7 @@
           <w:color w:val="333333"/>
           <w:sz w:val="17"/>
         </w:rPr>
-        <w:t>│  ferment_log · braumat_import · dashboard · lo_status · ops_setting   │</w:t>
+        <w:t>│  brew_order · filter_order · lot_lock · lot_record · load_slip        │</w:t>
       </w:r>
       <w:r>
         <w:br/>
@@ -1149,7 +1149,7 @@
           <w:color w:val="333333"/>
           <w:sz w:val="17"/>
         </w:rPr>
-        <w:t>│  master_data · integration_connection · energy_external · filling_… │</w:t>
+        <w:t>│  ferment_log · braumat_import · dashboard · lo_status · ops_setting   │</w:t>
       </w:r>
       <w:r>
         <w:br/>
@@ -1160,7 +1160,7 @@
           <w:color w:val="333333"/>
           <w:sz w:val="17"/>
         </w:rPr>
-        <w:t>│  keg_external · wastewater_external · import_mapping/parser/runner/… │</w:t>
+        <w:t>│  master_data · integration_connection · energy_external · filling_… │</w:t>
       </w:r>
       <w:r>
         <w:br/>
@@ -1171,7 +1171,7 @@
           <w:color w:val="333333"/>
           <w:sz w:val="17"/>
         </w:rPr>
-        <w:t>│  custom_fields · ai · ai_tools · conversations · jobs · derived       │</w:t>
+        <w:t>│  keg_external · wastewater_external · import_mapping/parser/runner/… │</w:t>
       </w:r>
       <w:r>
         <w:br/>
@@ -1182,7 +1182,7 @@
           <w:color w:val="333333"/>
           <w:sz w:val="17"/>
         </w:rPr>
-        <w:t>└───────────────┬──────────────────────────────────────────────────────┘</w:t>
+        <w:t>│  custom_fields · ai · ai_tools · conversations · jobs · derived · cip │</w:t>
       </w:r>
       <w:r>
         <w:br/>
@@ -1193,7 +1193,7 @@
           <w:color w:val="333333"/>
           <w:sz w:val="17"/>
         </w:rPr>
-        <w:t>┌───────────────▼──────────────────────────────────────────────────────┐</w:t>
+        <w:t>└───────────────┬──────────────────────────────────────────────────────┘</w:t>
       </w:r>
       <w:r>
         <w:br/>
@@ -1204,7 +1204,18 @@
           <w:color w:val="333333"/>
           <w:sz w:val="17"/>
         </w:rPr>
-        <w:t>│  MODELS (SQLAlchemy ORM) — ~100 lớp / 31 file theo bounded context     │</w:t>
+        <w:t>┌───────────────▼──────────────────────────────────────────────────────┐</w:t>
+      </w:r>
+      <w:r>
+        <w:br/>
+      </w:r>
+      <w:r>
+        <w:rPr>
+          <w:rFonts w:ascii="Consolas" w:hAnsi="Consolas"/>
+          <w:color w:val="333333"/>
+          <w:sz w:val="17"/>
+        </w:rPr>
+        <w:t>│  MODELS (SQLAlchemy ORM) — ~104 lớp / 32 file theo bounded context     │</w:t>
       </w:r>
       <w:r>
         <w:br/>
@@ -2942,7 +2953,7 @@
           <w:color w:val="333333"/>
           <w:sz w:val="17"/>
         </w:rPr>
-        <w:t>│   │   ├── main.py            # FastAPI app: mount 32 router + UI, middleware, ánh xạ lỗi→HTTP</w:t>
+        <w:t>│   │   ├── main.py            # FastAPI app: mount 33 router + UI, middleware, ánh xạ lỗi→HTTP</w:t>
       </w:r>
       <w:r>
         <w:br/>
@@ -2997,7 +3008,7 @@
           <w:color w:val="333333"/>
           <w:sz w:val="17"/>
         </w:rPr>
-        <w:t>│   │   ├── models/            # ORM theo bounded context (~100 lớp / 31 file)</w:t>
+        <w:t>│   │   ├── models/            # ORM theo bounded context (~104 lớp / 32 file)</w:t>
       </w:r>
       <w:r>
         <w:br/>
@@ -3008,7 +3019,7 @@
           <w:color w:val="333333"/>
           <w:sz w:val="17"/>
         </w:rPr>
-        <w:t>│   │   ├── services/          # quy tắc nghiệp vụ (47 module)</w:t>
+        <w:t>│   │   ├── services/          # quy tắc nghiệp vụ (48 module)</w:t>
       </w:r>
       <w:r>
         <w:br/>
@@ -3019,7 +3030,7 @@
           <w:color w:val="333333"/>
           <w:sz w:val="17"/>
         </w:rPr>
-        <w:t>│   │   └── routers/           # REST endpoints (32 router, ~379 endpoint)</w:t>
+        <w:t>│   │   └── routers/           # REST endpoints (33 router, ~397 endpoint)</w:t>
       </w:r>
       <w:r>
         <w:br/>
@@ -3164,7 +3175,7 @@
     </w:p>
     <w:p>
       <w:r>
-        <w:t xml:space="preserve">~100 lớp ORM, nhóm theo bounded context. Mỗi bảng dưới đây thuộc một file trong </w:t>
+        <w:t xml:space="preserve">~104 lớp ORM, nhóm theo bounded context. Mỗi bảng dưới đây thuộc một file trong </w:t>
       </w:r>
       <w:r>
         <w:rPr>
@@ -4800,7 +4811,90 @@
               <w:rPr>
                 <w:sz w:val="18"/>
               </w:rPr>
-              <w:t xml:space="preserve"> phân cấp tương tự Lệnh nấu; mỗi lệnh con gồm N tank nguồn (CCT hoặc BBT tái lọc) với thể tích kế hoạch riêng từng tank</w:t>
+              <w:t xml:space="preserve"> phân cấp tương tự Lệnh nấu; mỗi lệnh con gồm N tank nguồn (CCT hoặc BBT tái lọc) với thể tích kế hoạch riêng từng tank. </w:t>
+            </w:r>
+            <w:r>
+              <w:rPr>
+                <w:rFonts w:ascii="Consolas" w:hAnsi="Consolas"/>
+                <w:color w:val="B03A2E"/>
+                <w:sz w:val="19"/>
+              </w:rPr>
+              <w:t>batch_number</w:t>
+            </w:r>
+            <w:r>
+              <w:rPr>
+                <w:sz w:val="18"/>
+              </w:rPr>
+              <w:t>/</w:t>
+            </w:r>
+            <w:r>
+              <w:rPr>
+                <w:rFonts w:ascii="Consolas" w:hAnsi="Consolas"/>
+                <w:color w:val="B03A2E"/>
+                <w:sz w:val="19"/>
+              </w:rPr>
+              <w:t>order_number</w:t>
+            </w:r>
+            <w:r>
+              <w:rPr>
+                <w:sz w:val="18"/>
+              </w:rPr>
+              <w:t xml:space="preserve"> </w:t>
+            </w:r>
+            <w:r>
+              <w:rPr>
+                <w:b/>
+                <w:sz w:val="18"/>
+              </w:rPr>
+              <w:t>được phép trùng</w:t>
+            </w:r>
+            <w:r>
+              <w:rPr>
+                <w:sz w:val="18"/>
+              </w:rPr>
+              <w:t xml:space="preserve"> giữa các lệnh lọc khác nhau (trước bị chặn unique) — mỗi dòng "mẻ lọc số" nhận diện qua bộ 3 </w:t>
+            </w:r>
+            <w:r>
+              <w:rPr>
+                <w:rFonts w:ascii="Consolas" w:hAnsi="Consolas"/>
+                <w:color w:val="B03A2E"/>
+                <w:sz w:val="19"/>
+              </w:rPr>
+              <w:t>(batch_number, order_number, batch_seq_no)</w:t>
+            </w:r>
+            <w:r>
+              <w:rPr>
+                <w:sz w:val="18"/>
+              </w:rPr>
+              <w:t xml:space="preserve">; cờ </w:t>
+            </w:r>
+            <w:r>
+              <w:rPr>
+                <w:rFonts w:ascii="Consolas" w:hAnsi="Consolas"/>
+                <w:color w:val="B03A2E"/>
+                <w:sz w:val="19"/>
+              </w:rPr>
+              <w:t>is_final_batch</w:t>
+            </w:r>
+            <w:r>
+              <w:rPr>
+                <w:sz w:val="18"/>
+              </w:rPr>
+              <w:t xml:space="preserve"> đánh dấu đợt rút CUỐI để loại khỏi phân loại Thấp/Cao sản lượng (</w:t>
+            </w:r>
+            <w:r>
+              <w:rPr>
+                <w:rFonts w:ascii="Consolas" w:hAnsi="Consolas"/>
+                <w:color w:val="B03A2E"/>
+                <w:sz w:val="19"/>
+              </w:rPr>
+              <w:t>services/filter_yield_report.py</w:t>
+            </w:r>
+            <w:r>
+              <w:rPr>
+                <w:sz w:val="18"/>
+              </w:rPr>
+              <w:t>)</w:t>
             </w:r>
           </w:p>
         </w:tc>
@@ -8209,7 +8303,7 @@
         <w:pStyle w:val="Heading3"/>
       </w:pPr>
       <w:r>
-        <w:t>5.10 Kho thành phẩm (WMS — 8 lớp) &amp; bao bì tuần hoàn (wms.py, packaging.py)</w:t>
+        <w:t>5.10 Kho thành phẩm (WMS — 9 lớp) &amp; bao bì tuần hoàn (wms.py, packaging.py, master.py)</w:t>
       </w:r>
     </w:p>
     <w:tbl>
@@ -8303,7 +8397,7 @@
                 <w:color w:val="B03A2E"/>
                 <w:sz w:val="19"/>
               </w:rPr>
-              <w:t>wms_location</w:t>
+              <w:t>unit_type_catalog</w:t>
             </w:r>
             <w:r>
               <w:rPr>
@@ -8316,7 +8410,21 @@
                 <w:b/>
                 <w:sz w:val="18"/>
               </w:rPr>
-              <w:t>WmsLocation</w:t>
+              <w:t>UnitTypeCatalog</w:t>
+            </w:r>
+            <w:r>
+              <w:rPr>
+                <w:sz w:val="18"/>
+              </w:rPr>
+              <w:t xml:space="preserve">, </w:t>
+            </w:r>
+            <w:r>
+              <w:rPr>
+                <w:rFonts w:ascii="Consolas" w:hAnsi="Consolas"/>
+                <w:color w:val="B03A2E"/>
+                <w:sz w:val="19"/>
+              </w:rPr>
+              <w:t>master.py</w:t>
             </w:r>
             <w:r>
               <w:rPr>
@@ -8342,9 +8450,323 @@
             </w:pPr>
             <w:r>
               <w:rPr>
-                <w:sz w:val="18"/>
-              </w:rPr>
-              <w:t>Vị trí kho thành phẩm</w:t>
+                <w:b/>
+                <w:sz w:val="18"/>
+              </w:rPr>
+              <w:t>Danh mục Loại đơn vị tồn kho</w:t>
+            </w:r>
+            <w:r>
+              <w:rPr>
+                <w:sz w:val="18"/>
+              </w:rPr>
+              <w:t xml:space="preserve"> — thay hardcode chuỗi "vi"/"keg"/"lon" trước đây: </w:t>
+            </w:r>
+            <w:r>
+              <w:rPr>
+                <w:rFonts w:ascii="Consolas" w:hAnsi="Consolas"/>
+                <w:color w:val="B03A2E"/>
+                <w:sz w:val="19"/>
+              </w:rPr>
+              <w:t>code</w:t>
+            </w:r>
+            <w:r>
+              <w:rPr>
+                <w:sz w:val="18"/>
+              </w:rPr>
+              <w:t xml:space="preserve"> (khoá tra cứu logic, PHẢI chữ thường không dấu — regex </w:t>
+            </w:r>
+            <w:r>
+              <w:rPr>
+                <w:rFonts w:ascii="Consolas" w:hAnsi="Consolas"/>
+                <w:color w:val="B03A2E"/>
+                <w:sz w:val="19"/>
+              </w:rPr>
+              <w:t>^[a-z0-9_-]+$</w:t>
+            </w:r>
+            <w:r>
+              <w:rPr>
+                <w:sz w:val="18"/>
+              </w:rPr>
+              <w:t xml:space="preserve">, tự hạ chữ thường khi gõ hoa), </w:t>
+            </w:r>
+            <w:r>
+              <w:rPr>
+                <w:rFonts w:ascii="Consolas" w:hAnsi="Consolas"/>
+                <w:color w:val="B03A2E"/>
+                <w:sz w:val="19"/>
+              </w:rPr>
+              <w:t>name</w:t>
+            </w:r>
+            <w:r>
+              <w:rPr>
+                <w:sz w:val="18"/>
+              </w:rPr>
+              <w:t xml:space="preserve"> (nhãn hiển thị có dấu), </w:t>
+            </w:r>
+            <w:r>
+              <w:rPr>
+                <w:rFonts w:ascii="Consolas" w:hAnsi="Consolas"/>
+                <w:color w:val="B03A2E"/>
+                <w:sz w:val="19"/>
+              </w:rPr>
+              <w:t>divide_by_pack_size</w:t>
+            </w:r>
+            <w:r>
+              <w:rPr>
+                <w:sz w:val="18"/>
+              </w:rPr>
+              <w:t xml:space="preserve"> (bool — loại này có chia </w:t>
+            </w:r>
+            <w:r>
+              <w:rPr>
+                <w:rFonts w:ascii="Consolas" w:hAnsi="Consolas"/>
+                <w:color w:val="B03A2E"/>
+                <w:sz w:val="19"/>
+              </w:rPr>
+              <w:t>quantity</w:t>
+            </w:r>
+            <w:r>
+              <w:rPr>
+                <w:sz w:val="18"/>
+              </w:rPr>
+              <w:t xml:space="preserve"> theo </w:t>
+            </w:r>
+            <w:r>
+              <w:rPr>
+                <w:rFonts w:ascii="Consolas" w:hAnsi="Consolas"/>
+                <w:color w:val="B03A2E"/>
+                <w:sz w:val="19"/>
+              </w:rPr>
+              <w:t>pack_size</w:t>
+            </w:r>
+            <w:r>
+              <w:rPr>
+                <w:sz w:val="18"/>
+              </w:rPr>
+              <w:t xml:space="preserve"> khi quy đổi ra số đơn vị đóng gói hay không, giống "vi"), </w:t>
+            </w:r>
+            <w:r>
+              <w:rPr>
+                <w:rFonts w:ascii="Consolas" w:hAnsi="Consolas"/>
+                <w:color w:val="B03A2E"/>
+                <w:sz w:val="19"/>
+              </w:rPr>
+              <w:t>selectable</w:t>
+            </w:r>
+            <w:r>
+              <w:rPr>
+                <w:sz w:val="18"/>
+              </w:rPr>
+              <w:t xml:space="preserve"> (ẩn khỏi lựa chọn khi khai báo SKU mới — vd "lon" do hệ thống tự sinh khi phân rã, không cho chọn tay), </w:t>
+            </w:r>
+            <w:r>
+              <w:rPr>
+                <w:rFonts w:ascii="Consolas" w:hAnsi="Consolas"/>
+                <w:color w:val="B03A2E"/>
+                <w:sz w:val="19"/>
+              </w:rPr>
+              <w:t>active</w:t>
+            </w:r>
+            <w:r>
+              <w:rPr>
+                <w:sz w:val="18"/>
+              </w:rPr>
+              <w:t xml:space="preserve">. </w:t>
+            </w:r>
+            <w:r>
+              <w:rPr>
+                <w:rFonts w:ascii="Consolas" w:hAnsi="Consolas"/>
+                <w:color w:val="B03A2E"/>
+                <w:sz w:val="19"/>
+              </w:rPr>
+              <w:t>services/wms.py</w:t>
+            </w:r>
+            <w:r>
+              <w:rPr>
+                <w:sz w:val="18"/>
+              </w:rPr>
+              <w:t xml:space="preserve"> (</w:t>
+            </w:r>
+            <w:r>
+              <w:rPr>
+                <w:rFonts w:ascii="Consolas" w:hAnsi="Consolas"/>
+                <w:color w:val="B03A2E"/>
+                <w:sz w:val="19"/>
+              </w:rPr>
+              <w:t>_pack_divisor</w:t>
+            </w:r>
+            <w:r>
+              <w:rPr>
+                <w:sz w:val="18"/>
+              </w:rPr>
+              <w:t>/</w:t>
+            </w:r>
+            <w:r>
+              <w:rPr>
+                <w:rFonts w:ascii="Consolas" w:hAnsi="Consolas"/>
+                <w:color w:val="B03A2E"/>
+                <w:sz w:val="19"/>
+              </w:rPr>
+              <w:t>_pack_divisor_expr</w:t>
+            </w:r>
+            <w:r>
+              <w:rPr>
+                <w:sz w:val="18"/>
+              </w:rPr>
+              <w:t xml:space="preserve">), </w:t>
+            </w:r>
+            <w:r>
+              <w:rPr>
+                <w:rFonts w:ascii="Consolas" w:hAnsi="Consolas"/>
+                <w:color w:val="B03A2E"/>
+                <w:sz w:val="19"/>
+              </w:rPr>
+              <w:t>services/genealogy.py</w:t>
+            </w:r>
+            <w:r>
+              <w:rPr>
+                <w:sz w:val="18"/>
+              </w:rPr>
+              <w:t xml:space="preserve">, </w:t>
+            </w:r>
+            <w:r>
+              <w:rPr>
+                <w:rFonts w:ascii="Consolas" w:hAnsi="Consolas"/>
+                <w:color w:val="B03A2E"/>
+                <w:sz w:val="19"/>
+              </w:rPr>
+              <w:t>routers/wms.py</w:t>
+            </w:r>
+            <w:r>
+              <w:rPr>
+                <w:sz w:val="18"/>
+              </w:rPr>
+              <w:t xml:space="preserve"> đọc theo danh mục này; CRUD tại </w:t>
+            </w:r>
+            <w:r>
+              <w:rPr>
+                <w:rFonts w:ascii="Consolas" w:hAnsi="Consolas"/>
+                <w:color w:val="B03A2E"/>
+                <w:sz w:val="19"/>
+              </w:rPr>
+              <w:t>/api/unit-types</w:t>
+            </w:r>
+            <w:r>
+              <w:rPr>
+                <w:sz w:val="18"/>
+              </w:rPr>
+              <w:t xml:space="preserve"> (</w:t>
+            </w:r>
+            <w:r>
+              <w:rPr>
+                <w:rFonts w:ascii="Consolas" w:hAnsi="Consolas"/>
+                <w:color w:val="B03A2E"/>
+                <w:sz w:val="19"/>
+              </w:rPr>
+              <w:t>master.py</w:t>
+            </w:r>
+            <w:r>
+              <w:rPr>
+                <w:sz w:val="18"/>
+              </w:rPr>
+              <w:t xml:space="preserve">). </w:t>
+            </w:r>
+            <w:r>
+              <w:rPr>
+                <w:b/>
+                <w:sz w:val="18"/>
+              </w:rPr>
+              <w:t>Fix lỗi gốc</w:t>
+            </w:r>
+            <w:r>
+              <w:rPr>
+                <w:sz w:val="18"/>
+              </w:rPr>
+              <w:t xml:space="preserve">: trước đây ô "Mã" khi tạo danh mục là input tự do không validate — gõ nhầm tên có dấu ("Vỉ") vào ô Mã (đáng lẽ gõ ở ô Tên) tạo ra </w:t>
+            </w:r>
+            <w:r>
+              <w:rPr>
+                <w:rFonts w:ascii="Consolas" w:hAnsi="Consolas"/>
+                <w:color w:val="B03A2E"/>
+                <w:sz w:val="19"/>
+              </w:rPr>
+              <w:t>code</w:t>
+            </w:r>
+            <w:r>
+              <w:rPr>
+                <w:sz w:val="18"/>
+              </w:rPr>
+              <w:t xml:space="preserve"> lạ khác "vi", khiến SKU gán loại đó không được </w:t>
+            </w:r>
+            <w:r>
+              <w:rPr>
+                <w:rFonts w:ascii="Consolas" w:hAnsi="Consolas"/>
+                <w:color w:val="B03A2E"/>
+                <w:sz w:val="19"/>
+              </w:rPr>
+              <w:t>_pack_divisor</w:t>
+            </w:r>
+            <w:r>
+              <w:rPr>
+                <w:sz w:val="18"/>
+              </w:rPr>
+              <w:t xml:space="preserve"> chia theo </w:t>
+            </w:r>
+            <w:r>
+              <w:rPr>
+                <w:rFonts w:ascii="Consolas" w:hAnsi="Consolas"/>
+                <w:color w:val="B03A2E"/>
+                <w:sz w:val="19"/>
+              </w:rPr>
+              <w:t>pack_size</w:t>
+            </w:r>
+            <w:r>
+              <w:rPr>
+                <w:sz w:val="18"/>
+              </w:rPr>
+              <w:t xml:space="preserve"> → đếm sai tồn (vd lô 100.000 vỉ bị đếm nguyên thay vì chia 24). Nay </w:t>
+            </w:r>
+            <w:r>
+              <w:rPr>
+                <w:rFonts w:ascii="Consolas" w:hAnsi="Consolas"/>
+                <w:color w:val="B03A2E"/>
+                <w:sz w:val="19"/>
+              </w:rPr>
+              <w:t>UnitTypeCatalogIn.code</w:t>
+            </w:r>
+            <w:r>
+              <w:rPr>
+                <w:sz w:val="18"/>
+              </w:rPr>
+              <w:t xml:space="preserve"> validate + tự hạ chữ thường ở tầng schema, đồng thời </w:t>
+            </w:r>
+            <w:r>
+              <w:rPr>
+                <w:rFonts w:ascii="Consolas" w:hAnsi="Consolas"/>
+                <w:color w:val="B03A2E"/>
+                <w:sz w:val="19"/>
+              </w:rPr>
+              <w:t>FinishedProduct.unit_type</w:t>
+            </w:r>
+            <w:r>
+              <w:rPr>
+                <w:sz w:val="18"/>
+              </w:rPr>
+              <w:t xml:space="preserve"> khi tạo/sửa SKU và </w:t>
+            </w:r>
+            <w:r>
+              <w:rPr>
+                <w:rFonts w:ascii="Consolas" w:hAnsi="Consolas"/>
+                <w:color w:val="B03A2E"/>
+                <w:sz w:val="19"/>
+              </w:rPr>
+              <w:t>_create_units</w:t>
+            </w:r>
+            <w:r>
+              <w:rPr>
+                <w:sz w:val="18"/>
+              </w:rPr>
+              <w:t xml:space="preserve"> (build_units + import tồn đầu Excel) đều đối chiếu lại danh mục trước khi ghi.</w:t>
             </w:r>
           </w:p>
         </w:tc>
@@ -8371,7 +8793,7 @@
                 <w:color w:val="B03A2E"/>
                 <w:sz w:val="19"/>
               </w:rPr>
-              <w:t>finished_goods_unit</w:t>
+              <w:t>wms_location</w:t>
             </w:r>
             <w:r>
               <w:rPr>
@@ -8384,7 +8806,7 @@
                 <w:b/>
                 <w:sz w:val="18"/>
               </w:rPr>
-              <w:t>FinishedGoodsUnit</w:t>
+              <w:t>WmsLocation</w:t>
             </w:r>
             <w:r>
               <w:rPr>
@@ -8411,126 +8833,9 @@
             </w:pPr>
             <w:r>
               <w:rPr>
-                <w:b/>
-                <w:sz w:val="18"/>
-              </w:rPr>
-              <w:t>Đơn vị LÔ thành phẩm</w:t>
-            </w:r>
-            <w:r>
-              <w:rPr>
-                <w:sz w:val="18"/>
-              </w:rPr>
-              <w:t xml:space="preserve"> (thay thế hoàn toàn Pallet/Case/ShipmentLine cũ) — thiết kế lại theo LÔ (2026-07): mỗi dòng đại diện </w:t>
-            </w:r>
-            <w:r>
-              <w:rPr>
-                <w:b/>
-                <w:sz w:val="18"/>
-              </w:rPr>
-              <w:t>1 lô</w:t>
-            </w:r>
-            <w:r>
-              <w:rPr>
-                <w:sz w:val="18"/>
-              </w:rPr>
-              <w:t xml:space="preserve"> (không còn 1 dòng/vỉ), </w:t>
-            </w:r>
-            <w:r>
-              <w:rPr>
-                <w:rFonts w:ascii="Consolas" w:hAnsi="Consolas"/>
-                <w:color w:val="B03A2E"/>
-                <w:sz w:val="19"/>
-              </w:rPr>
-              <w:t>quantity</w:t>
-            </w:r>
-            <w:r>
-              <w:rPr>
-                <w:sz w:val="18"/>
-              </w:rPr>
-              <w:t xml:space="preserve"> = tổng SL nhỏ (lon/keg) của cả lô, nên duyệt chiết luôn ra ĐÚNG 1 dòng bất kể quy mô (fix scale-bomb: lô 190.000 vỉ trước đây tạo ~190.000 dòng, treo nút Duyệt trên SQL Server). Xuất/phân rã (decompose)/điều chuyển (relocate)/xuất tự do MỘT PHẦN sẽ </w:t>
-            </w:r>
-            <w:r>
-              <w:rPr>
-                <w:b/>
-                <w:sz w:val="18"/>
-              </w:rPr>
-              <w:t>tách dòng</w:t>
-            </w:r>
-            <w:r>
-              <w:rPr>
-                <w:sz w:val="18"/>
-              </w:rPr>
-              <w:t xml:space="preserve"> theo FIFO (</w:t>
-            </w:r>
-            <w:r>
-              <w:rPr>
-                <w:rFonts w:ascii="Consolas" w:hAnsi="Consolas"/>
-                <w:color w:val="B03A2E"/>
-                <w:sz w:val="19"/>
-              </w:rPr>
-              <w:t>_consume_lot_rows</w:t>
-            </w:r>
-            <w:r>
-              <w:rPr>
-                <w:sz w:val="18"/>
-              </w:rPr>
-              <w:t xml:space="preserve">) — dòng mới mang đúng phần đã xử lý, dòng gốc giữ phần dư — thay vì chọn/xóa từng vỉ; </w:t>
-            </w:r>
-            <w:r>
-              <w:rPr>
-                <w:rFonts w:ascii="Consolas" w:hAnsi="Consolas"/>
-                <w:color w:val="B03A2E"/>
-                <w:sz w:val="19"/>
-              </w:rPr>
-              <w:t>pack_size</w:t>
-            </w:r>
-            <w:r>
-              <w:rPr>
-                <w:sz w:val="18"/>
-              </w:rPr>
-              <w:t xml:space="preserve"> (khai báo ở Danh mục Sản phẩm) chỉ dùng ở tầng đọc để quy đổi </w:t>
-            </w:r>
-            <w:r>
-              <w:rPr>
-                <w:rFonts w:ascii="Consolas" w:hAnsi="Consolas"/>
-                <w:color w:val="B03A2E"/>
-                <w:sz w:val="19"/>
-              </w:rPr>
-              <w:t>quantity</w:t>
-            </w:r>
-            <w:r>
-              <w:rPr>
-                <w:sz w:val="18"/>
-              </w:rPr>
-              <w:t xml:space="preserve"> ra số vỉ/keg hiển thị. Còn </w:t>
-            </w:r>
-            <w:r>
-              <w:rPr>
-                <w:rFonts w:ascii="Consolas" w:hAnsi="Consolas"/>
-                <w:color w:val="B03A2E"/>
-                <w:sz w:val="19"/>
-              </w:rPr>
-              <w:t>is_near_expiry</w:t>
-            </w:r>
-            <w:r>
-              <w:rPr>
-                <w:sz w:val="18"/>
-              </w:rPr>
-              <w:t xml:space="preserve"> cho bia cận date. Xem </w:t>
-            </w:r>
-            <w:r>
-              <w:rPr>
-                <w:rFonts w:ascii="Consolas" w:hAnsi="Consolas"/>
-                <w:color w:val="B03A2E"/>
-                <w:sz w:val="19"/>
-              </w:rPr>
-              <w:t>docs/WMS-LOT-LEVEL-REDESIGN.md</w:t>
-            </w:r>
-            <w:r>
-              <w:rPr>
-                <w:sz w:val="18"/>
-              </w:rPr>
-              <w:t>.</w:t>
+                <w:sz w:val="18"/>
+              </w:rPr>
+              <w:t>Vị trí kho thành phẩm</w:t>
             </w:r>
           </w:p>
         </w:tc>
@@ -8556,7 +8861,7 @@
                 <w:color w:val="B03A2E"/>
                 <w:sz w:val="19"/>
               </w:rPr>
-              <w:t>near_expiry_entry</w:t>
+              <w:t>finished_goods_unit</w:t>
             </w:r>
             <w:r>
               <w:rPr>
@@ -8569,7 +8874,7 @@
                 <w:b/>
                 <w:sz w:val="18"/>
               </w:rPr>
-              <w:t>NearExpiryEntry</w:t>
+              <w:t>FinishedGoodsUnit</w:t>
             </w:r>
             <w:r>
               <w:rPr>
@@ -8595,9 +8900,126 @@
             </w:pPr>
             <w:r>
               <w:rPr>
-                <w:sz w:val="18"/>
-              </w:rPr>
-              <w:t>Bia cận date nhập thủ công (không qua Chiết bình thường)</w:t>
+                <w:b/>
+                <w:sz w:val="18"/>
+              </w:rPr>
+              <w:t>Đơn vị LÔ thành phẩm</w:t>
+            </w:r>
+            <w:r>
+              <w:rPr>
+                <w:sz w:val="18"/>
+              </w:rPr>
+              <w:t xml:space="preserve"> (thay thế hoàn toàn Pallet/Case/ShipmentLine cũ) — thiết kế lại theo LÔ (2026-07): mỗi dòng đại diện </w:t>
+            </w:r>
+            <w:r>
+              <w:rPr>
+                <w:b/>
+                <w:sz w:val="18"/>
+              </w:rPr>
+              <w:t>1 lô</w:t>
+            </w:r>
+            <w:r>
+              <w:rPr>
+                <w:sz w:val="18"/>
+              </w:rPr>
+              <w:t xml:space="preserve"> (không còn 1 dòng/vỉ), </w:t>
+            </w:r>
+            <w:r>
+              <w:rPr>
+                <w:rFonts w:ascii="Consolas" w:hAnsi="Consolas"/>
+                <w:color w:val="B03A2E"/>
+                <w:sz w:val="19"/>
+              </w:rPr>
+              <w:t>quantity</w:t>
+            </w:r>
+            <w:r>
+              <w:rPr>
+                <w:sz w:val="18"/>
+              </w:rPr>
+              <w:t xml:space="preserve"> = tổng SL nhỏ (lon/keg) của cả lô, nên duyệt chiết luôn ra ĐÚNG 1 dòng bất kể quy mô (fix scale-bomb: lô 190.000 vỉ trước đây tạo ~190.000 dòng, treo nút Duyệt trên SQL Server). Xuất/phân rã (decompose)/điều chuyển (relocate)/xuất tự do MỘT PHẦN sẽ </w:t>
+            </w:r>
+            <w:r>
+              <w:rPr>
+                <w:b/>
+                <w:sz w:val="18"/>
+              </w:rPr>
+              <w:t>tách dòng</w:t>
+            </w:r>
+            <w:r>
+              <w:rPr>
+                <w:sz w:val="18"/>
+              </w:rPr>
+              <w:t xml:space="preserve"> theo FIFO (</w:t>
+            </w:r>
+            <w:r>
+              <w:rPr>
+                <w:rFonts w:ascii="Consolas" w:hAnsi="Consolas"/>
+                <w:color w:val="B03A2E"/>
+                <w:sz w:val="19"/>
+              </w:rPr>
+              <w:t>_consume_lot_rows</w:t>
+            </w:r>
+            <w:r>
+              <w:rPr>
+                <w:sz w:val="18"/>
+              </w:rPr>
+              <w:t xml:space="preserve">) — dòng mới mang đúng phần đã xử lý, dòng gốc giữ phần dư — thay vì chọn/xóa từng vỉ; </w:t>
+            </w:r>
+            <w:r>
+              <w:rPr>
+                <w:rFonts w:ascii="Consolas" w:hAnsi="Consolas"/>
+                <w:color w:val="B03A2E"/>
+                <w:sz w:val="19"/>
+              </w:rPr>
+              <w:t>pack_size</w:t>
+            </w:r>
+            <w:r>
+              <w:rPr>
+                <w:sz w:val="18"/>
+              </w:rPr>
+              <w:t xml:space="preserve"> (khai báo ở Danh mục Sản phẩm) chỉ dùng ở tầng đọc để quy đổi </w:t>
+            </w:r>
+            <w:r>
+              <w:rPr>
+                <w:rFonts w:ascii="Consolas" w:hAnsi="Consolas"/>
+                <w:color w:val="B03A2E"/>
+                <w:sz w:val="19"/>
+              </w:rPr>
+              <w:t>quantity</w:t>
+            </w:r>
+            <w:r>
+              <w:rPr>
+                <w:sz w:val="18"/>
+              </w:rPr>
+              <w:t xml:space="preserve"> ra số vỉ/keg hiển thị. Còn </w:t>
+            </w:r>
+            <w:r>
+              <w:rPr>
+                <w:rFonts w:ascii="Consolas" w:hAnsi="Consolas"/>
+                <w:color w:val="B03A2E"/>
+                <w:sz w:val="19"/>
+              </w:rPr>
+              <w:t>is_near_expiry</w:t>
+            </w:r>
+            <w:r>
+              <w:rPr>
+                <w:sz w:val="18"/>
+              </w:rPr>
+              <w:t xml:space="preserve"> cho bia cận date. Xem </w:t>
+            </w:r>
+            <w:r>
+              <w:rPr>
+                <w:rFonts w:ascii="Consolas" w:hAnsi="Consolas"/>
+                <w:color w:val="B03A2E"/>
+                <w:sz w:val="19"/>
+              </w:rPr>
+              <w:t>docs/WMS-LOT-LEVEL-REDESIGN.md</w:t>
+            </w:r>
+            <w:r>
+              <w:rPr>
+                <w:sz w:val="18"/>
+              </w:rPr>
+              <w:t>.</w:t>
             </w:r>
           </w:p>
         </w:tc>
@@ -8624,7 +9046,7 @@
                 <w:color w:val="B03A2E"/>
                 <w:sz w:val="19"/>
               </w:rPr>
-              <w:t>ship_to_location</w:t>
+              <w:t>near_expiry_entry</w:t>
             </w:r>
             <w:r>
               <w:rPr>
@@ -8637,7 +9059,7 @@
                 <w:b/>
                 <w:sz w:val="18"/>
               </w:rPr>
-              <w:t>ShipToLocation</w:t>
+              <w:t>NearExpiryEntry</w:t>
             </w:r>
             <w:r>
               <w:rPr>
@@ -8666,7 +9088,7 @@
               <w:rPr>
                 <w:sz w:val="18"/>
               </w:rPr>
-              <w:t>Danh mục nơi xuất đến</w:t>
+              <w:t>Bia cận date nhập thủ công (không qua Chiết bình thường)</w:t>
             </w:r>
           </w:p>
         </w:tc>
@@ -8692,7 +9114,7 @@
                 <w:color w:val="B03A2E"/>
                 <w:sz w:val="19"/>
               </w:rPr>
-              <w:t>vehicle</w:t>
+              <w:t>ship_to_location</w:t>
             </w:r>
             <w:r>
               <w:rPr>
@@ -8705,7 +9127,7 @@
                 <w:b/>
                 <w:sz w:val="18"/>
               </w:rPr>
-              <w:t>Vehicle</w:t>
+              <w:t>ShipToLocation</w:t>
             </w:r>
             <w:r>
               <w:rPr>
@@ -8733,7 +9155,7 @@
               <w:rPr>
                 <w:sz w:val="18"/>
               </w:rPr>
-              <w:t>Danh mục phương tiện vận chuyển</w:t>
+              <w:t>Danh mục nơi xuất đến</w:t>
             </w:r>
           </w:p>
         </w:tc>
@@ -8760,7 +9182,7 @@
                 <w:color w:val="B03A2E"/>
                 <w:sz w:val="19"/>
               </w:rPr>
-              <w:t>shipment</w:t>
+              <w:t>vehicle</w:t>
             </w:r>
             <w:r>
               <w:rPr>
@@ -8773,7 +9195,7 @@
                 <w:b/>
                 <w:sz w:val="18"/>
               </w:rPr>
-              <w:t>Shipment</w:t>
+              <w:t>Vehicle</w:t>
             </w:r>
             <w:r>
               <w:rPr>
@@ -8802,29 +9224,7 @@
               <w:rPr>
                 <w:sz w:val="18"/>
               </w:rPr>
-              <w:t xml:space="preserve">Phiếu xuất kho: header (người nhận/lái xe/xe/nơi đến), </w:t>
-            </w:r>
-            <w:r>
-              <w:rPr>
-                <w:rFonts w:ascii="Consolas" w:hAnsi="Consolas"/>
-                <w:color w:val="B03A2E"/>
-                <w:sz w:val="19"/>
-              </w:rPr>
-              <w:t>shipment_type</w:t>
-            </w:r>
-            <w:r>
-              <w:rPr>
-                <w:sz w:val="18"/>
-              </w:rPr>
-              <w:t xml:space="preserve">, </w:t>
-            </w:r>
-            <w:r>
-              <w:rPr>
-                <w:rFonts w:ascii="Consolas" w:hAnsi="Consolas"/>
-                <w:color w:val="B03A2E"/>
-                <w:sz w:val="19"/>
-              </w:rPr>
-              <w:t>fifo_ok</w:t>
+              <w:t>Danh mục phương tiện vận chuyển</w:t>
             </w:r>
           </w:p>
         </w:tc>
@@ -8850,21 +9250,7 @@
                 <w:color w:val="B03A2E"/>
                 <w:sz w:val="19"/>
               </w:rPr>
-              <w:t>load_slip</w:t>
-            </w:r>
-            <w:r>
-              <w:rPr>
-                <w:sz w:val="18"/>
-              </w:rPr>
-              <w:t xml:space="preserve"> / </w:t>
-            </w:r>
-            <w:r>
-              <w:rPr>
-                <w:rFonts w:ascii="Consolas" w:hAnsi="Consolas"/>
-                <w:color w:val="B03A2E"/>
-                <w:sz w:val="19"/>
-              </w:rPr>
-              <w:t>load_slip_line</w:t>
+              <w:t>shipment</w:t>
             </w:r>
             <w:r>
               <w:rPr>
@@ -8877,7 +9263,7 @@
                 <w:b/>
                 <w:sz w:val="18"/>
               </w:rPr>
-              <w:t>LoadSlip/…Line</w:t>
+              <w:t>Shipment</w:t>
             </w:r>
             <w:r>
               <w:rPr>
@@ -8905,7 +9291,29 @@
               <w:rPr>
                 <w:sz w:val="18"/>
               </w:rPr>
-              <w:t>Lệnh đóng hàng import từ Excel — danh mục 15 dòng cố định khớp mẫu giấy</w:t>
+              <w:t xml:space="preserve">Phiếu xuất kho: header (người nhận/lái xe/xe/nơi đến), </w:t>
+            </w:r>
+            <w:r>
+              <w:rPr>
+                <w:rFonts w:ascii="Consolas" w:hAnsi="Consolas"/>
+                <w:color w:val="B03A2E"/>
+                <w:sz w:val="19"/>
+              </w:rPr>
+              <w:t>shipment_type</w:t>
+            </w:r>
+            <w:r>
+              <w:rPr>
+                <w:sz w:val="18"/>
+              </w:rPr>
+              <w:t xml:space="preserve">, </w:t>
+            </w:r>
+            <w:r>
+              <w:rPr>
+                <w:rFonts w:ascii="Consolas" w:hAnsi="Consolas"/>
+                <w:color w:val="B03A2E"/>
+                <w:sz w:val="19"/>
+              </w:rPr>
+              <w:t>fifo_ok</w:t>
             </w:r>
           </w:p>
         </w:tc>
@@ -8932,7 +9340,7 @@
                 <w:color w:val="B03A2E"/>
                 <w:sz w:val="19"/>
               </w:rPr>
-              <w:t>packaging_type</w:t>
+              <w:t>load_slip</w:t>
             </w:r>
             <w:r>
               <w:rPr>
@@ -8946,7 +9354,26 @@
                 <w:color w:val="B03A2E"/>
                 <w:sz w:val="19"/>
               </w:rPr>
-              <w:t>packaging_move</w:t>
+              <w:t>load_slip_line</w:t>
+            </w:r>
+            <w:r>
+              <w:rPr>
+                <w:sz w:val="18"/>
+              </w:rPr>
+              <w:t xml:space="preserve"> (</w:t>
+            </w:r>
+            <w:r>
+              <w:rPr>
+                <w:b/>
+                <w:sz w:val="18"/>
+              </w:rPr>
+              <w:t>LoadSlip/…Line</w:t>
+            </w:r>
+            <w:r>
+              <w:rPr>
+                <w:sz w:val="18"/>
+              </w:rPr>
+              <w:t>)</w:t>
             </w:r>
           </w:p>
         </w:tc>
@@ -8954,6 +9381,68 @@
           <w:tcPr>
             <w:tcW w:type="dxa" w:w="4824"/>
             <w:shd w:val="clear" w:color="auto" w:fill="EEF2F8"/>
+            <w:tcMar>
+              <w:top w:w="60" w:type="dxa"/>
+              <w:bottom w:w="60" w:type="dxa"/>
+              <w:start w:w="110" w:type="dxa"/>
+              <w:end w:w="110" w:type="dxa"/>
+            </w:tcMar>
+          </w:tcPr>
+          <w:p>
+            <w:pPr>
+              <w:spacing w:after="0"/>
+            </w:pPr>
+            <w:r>
+              <w:rPr>
+                <w:sz w:val="18"/>
+              </w:rPr>
+              <w:t>Lệnh đóng hàng import từ Excel — danh mục 15 dòng cố định khớp mẫu giấy</w:t>
+            </w:r>
+          </w:p>
+        </w:tc>
+      </w:tr>
+      <w:tr>
+        <w:tc>
+          <w:tcPr>
+            <w:tcW w:type="dxa" w:w="4824"/>
+            <w:tcMar>
+              <w:top w:w="60" w:type="dxa"/>
+              <w:bottom w:w="60" w:type="dxa"/>
+              <w:start w:w="110" w:type="dxa"/>
+              <w:end w:w="110" w:type="dxa"/>
+            </w:tcMar>
+          </w:tcPr>
+          <w:p>
+            <w:pPr>
+              <w:spacing w:after="0"/>
+            </w:pPr>
+            <w:r>
+              <w:rPr>
+                <w:rFonts w:ascii="Consolas" w:hAnsi="Consolas"/>
+                <w:color w:val="B03A2E"/>
+                <w:sz w:val="19"/>
+              </w:rPr>
+              <w:t>packaging_type</w:t>
+            </w:r>
+            <w:r>
+              <w:rPr>
+                <w:sz w:val="18"/>
+              </w:rPr>
+              <w:t xml:space="preserve"> / </w:t>
+            </w:r>
+            <w:r>
+              <w:rPr>
+                <w:rFonts w:ascii="Consolas" w:hAnsi="Consolas"/>
+                <w:color w:val="B03A2E"/>
+                <w:sz w:val="19"/>
+              </w:rPr>
+              <w:t>packaging_move</w:t>
+            </w:r>
+          </w:p>
+        </w:tc>
+        <w:tc>
+          <w:tcPr>
+            <w:tcW w:type="dxa" w:w="4824"/>
             <w:tcMar>
               <w:top w:w="60" w:type="dxa"/>
               <w:bottom w:w="60" w:type="dxa"/>
@@ -9872,6 +10361,1028 @@
     </w:p>
     <w:p>
       <w:pPr>
+        <w:pStyle w:val="Heading3"/>
+      </w:pPr>
+      <w:r>
+        <w:t>5.14 Vệ sinh thiết bị — CIP (cip.py, services/cip.py)</w:t>
+      </w:r>
+    </w:p>
+    <w:p>
+      <w:r>
+        <w:t xml:space="preserve">Theo dõi vệ sinh CIP (Cleaning-In-Place) — nguồn gốc </w:t>
+      </w:r>
+      <w:r>
+        <w:rPr>
+          <w:b/>
+        </w:rPr>
+        <w:t>21 loại biểu mẫu giấy thật</w:t>
+      </w:r>
+      <w:r>
+        <w:t xml:space="preserve"> của nhà máy (mã </w:t>
+      </w:r>
+      <w:r>
+        <w:rPr>
+          <w:rFonts w:ascii="Consolas" w:hAnsi="Consolas"/>
+          <w:color w:val="B03A2E"/>
+          <w:sz w:val="19"/>
+        </w:rPr>
+        <w:t>QT-KCS-QT-BM-xx</w:t>
+      </w:r>
+      <w:r>
+        <w:t xml:space="preserve">), seed sẵn trong </w:t>
+      </w:r>
+      <w:r>
+        <w:rPr>
+          <w:rFonts w:ascii="Consolas" w:hAnsi="Consolas"/>
+          <w:color w:val="B03A2E"/>
+          <w:sz w:val="19"/>
+        </w:rPr>
+        <w:t>seed.py</w:t>
+      </w:r>
+      <w:r>
+        <w:t>. Thiết kế linh hoạt vì các mẫu giấy có số cột/loại thông số khác nhau — không hard-code theo từng loại biểu mẫu.</w:t>
+      </w:r>
+    </w:p>
+    <w:tbl>
+      <w:tblPr>
+        <w:tblW w:type="auto" w:w="0"/>
+        <w:jc w:val="center"/>
+        <w:tblLook w:firstColumn="1" w:firstRow="1" w:lastColumn="0" w:lastRow="0" w:noHBand="0" w:noVBand="1" w:val="04A0"/>
+        <w:tblBorders>
+          <w:top w:val="single" w:sz="4" w:space="0" w:color="BBBBBB"/>
+          <w:left w:val="single" w:sz="4" w:space="0" w:color="BBBBBB"/>
+          <w:bottom w:val="single" w:sz="4" w:space="0" w:color="BBBBBB"/>
+          <w:right w:val="single" w:sz="4" w:space="0" w:color="BBBBBB"/>
+          <w:insideH w:val="single" w:sz="4" w:space="0" w:color="BBBBBB"/>
+          <w:insideV w:val="single" w:sz="4" w:space="0" w:color="BBBBBB"/>
+        </w:tblBorders>
+      </w:tblPr>
+      <w:tblGrid>
+        <w:gridCol w:w="4824"/>
+        <w:gridCol w:w="4824"/>
+      </w:tblGrid>
+      <w:tr>
+        <w:tc>
+          <w:tcPr>
+            <w:tcW w:type="dxa" w:w="4824"/>
+            <w:shd w:val="clear" w:color="auto" w:fill="1E2761"/>
+            <w:tcMar>
+              <w:top w:w="60" w:type="dxa"/>
+              <w:bottom w:w="60" w:type="dxa"/>
+              <w:start w:w="110" w:type="dxa"/>
+              <w:end w:w="110" w:type="dxa"/>
+            </w:tcMar>
+          </w:tcPr>
+          <w:p>
+            <w:pPr>
+              <w:spacing w:after="0"/>
+            </w:pPr>
+            <w:r>
+              <w:rPr>
+                <w:b/>
+                <w:color w:val="FFFFFF"/>
+                <w:sz w:val="19"/>
+              </w:rPr>
+              <w:t>Bảng</w:t>
+            </w:r>
+          </w:p>
+        </w:tc>
+        <w:tc>
+          <w:tcPr>
+            <w:tcW w:type="dxa" w:w="4824"/>
+            <w:shd w:val="clear" w:color="auto" w:fill="1E2761"/>
+            <w:tcMar>
+              <w:top w:w="60" w:type="dxa"/>
+              <w:bottom w:w="60" w:type="dxa"/>
+              <w:start w:w="110" w:type="dxa"/>
+              <w:end w:w="110" w:type="dxa"/>
+            </w:tcMar>
+          </w:tcPr>
+          <w:p>
+            <w:pPr>
+              <w:spacing w:after="0"/>
+            </w:pPr>
+            <w:r>
+              <w:rPr>
+                <w:b/>
+                <w:color w:val="FFFFFF"/>
+                <w:sz w:val="19"/>
+              </w:rPr>
+              <w:t>Mục đích</w:t>
+            </w:r>
+          </w:p>
+        </w:tc>
+      </w:tr>
+      <w:tr>
+        <w:tc>
+          <w:tcPr>
+            <w:tcW w:type="dxa" w:w="4824"/>
+            <w:tcMar>
+              <w:top w:w="60" w:type="dxa"/>
+              <w:bottom w:w="60" w:type="dxa"/>
+              <w:start w:w="110" w:type="dxa"/>
+              <w:end w:w="110" w:type="dxa"/>
+            </w:tcMar>
+          </w:tcPr>
+          <w:p>
+            <w:pPr>
+              <w:spacing w:after="0"/>
+            </w:pPr>
+            <w:r>
+              <w:rPr>
+                <w:rFonts w:ascii="Consolas" w:hAnsi="Consolas"/>
+                <w:color w:val="B03A2E"/>
+                <w:sz w:val="19"/>
+              </w:rPr>
+              <w:t>cip_form_type</w:t>
+            </w:r>
+            <w:r>
+              <w:rPr>
+                <w:sz w:val="18"/>
+              </w:rPr>
+              <w:t xml:space="preserve"> (</w:t>
+            </w:r>
+            <w:r>
+              <w:rPr>
+                <w:b/>
+                <w:sz w:val="18"/>
+              </w:rPr>
+              <w:t>CipFormType</w:t>
+            </w:r>
+            <w:r>
+              <w:rPr>
+                <w:sz w:val="18"/>
+              </w:rPr>
+              <w:t>)</w:t>
+            </w:r>
+          </w:p>
+        </w:tc>
+        <w:tc>
+          <w:tcPr>
+            <w:tcW w:type="dxa" w:w="4824"/>
+            <w:tcMar>
+              <w:top w:w="60" w:type="dxa"/>
+              <w:bottom w:w="60" w:type="dxa"/>
+              <w:start w:w="110" w:type="dxa"/>
+              <w:end w:w="110" w:type="dxa"/>
+            </w:tcMar>
+          </w:tcPr>
+          <w:p>
+            <w:pPr>
+              <w:spacing w:after="0"/>
+            </w:pPr>
+            <w:r>
+              <w:rPr>
+                <w:sz w:val="18"/>
+              </w:rPr>
+              <w:t xml:space="preserve">Danh mục LOẠI biểu mẫu: </w:t>
+            </w:r>
+            <w:r>
+              <w:rPr>
+                <w:rFonts w:ascii="Consolas" w:hAnsi="Consolas"/>
+                <w:color w:val="B03A2E"/>
+                <w:sz w:val="19"/>
+              </w:rPr>
+              <w:t>code</w:t>
+            </w:r>
+            <w:r>
+              <w:rPr>
+                <w:sz w:val="18"/>
+              </w:rPr>
+              <w:t xml:space="preserve"> (unique, vd </w:t>
+            </w:r>
+            <w:r>
+              <w:rPr>
+                <w:rFonts w:ascii="Consolas" w:hAnsi="Consolas"/>
+                <w:color w:val="B03A2E"/>
+                <w:sz w:val="19"/>
+              </w:rPr>
+              <w:t>"2.1.2/2025/QT-KCS-QT-BM-01"</w:t>
+            </w:r>
+            <w:r>
+              <w:rPr>
+                <w:sz w:val="18"/>
+              </w:rPr>
+              <w:t xml:space="preserve">), </w:t>
+            </w:r>
+            <w:r>
+              <w:rPr>
+                <w:rFonts w:ascii="Consolas" w:hAnsi="Consolas"/>
+                <w:color w:val="B03A2E"/>
+                <w:sz w:val="19"/>
+              </w:rPr>
+              <w:t>name</w:t>
+            </w:r>
+            <w:r>
+              <w:rPr>
+                <w:sz w:val="18"/>
+              </w:rPr>
+              <w:t xml:space="preserve">, </w:t>
+            </w:r>
+            <w:r>
+              <w:rPr>
+                <w:rFonts w:ascii="Consolas" w:hAnsi="Consolas"/>
+                <w:color w:val="B03A2E"/>
+                <w:sz w:val="19"/>
+              </w:rPr>
+              <w:t>area</w:t>
+            </w:r>
+            <w:r>
+              <w:rPr>
+                <w:sz w:val="18"/>
+              </w:rPr>
+              <w:t xml:space="preserve"> (nau\</w:t>
+            </w:r>
+          </w:p>
+        </w:tc>
+      </w:tr>
+      <w:tr>
+        <w:tc>
+          <w:tcPr>
+            <w:tcW w:type="dxa" w:w="4824"/>
+            <w:shd w:val="clear" w:color="auto" w:fill="EEF2F8"/>
+            <w:tcMar>
+              <w:top w:w="60" w:type="dxa"/>
+              <w:bottom w:w="60" w:type="dxa"/>
+              <w:start w:w="110" w:type="dxa"/>
+              <w:end w:w="110" w:type="dxa"/>
+            </w:tcMar>
+          </w:tcPr>
+          <w:p>
+            <w:pPr>
+              <w:spacing w:after="0"/>
+            </w:pPr>
+            <w:r>
+              <w:rPr>
+                <w:rFonts w:ascii="Consolas" w:hAnsi="Consolas"/>
+                <w:color w:val="B03A2E"/>
+                <w:sz w:val="19"/>
+              </w:rPr>
+              <w:t>cip_equipment</w:t>
+            </w:r>
+            <w:r>
+              <w:rPr>
+                <w:sz w:val="18"/>
+              </w:rPr>
+              <w:t xml:space="preserve"> (</w:t>
+            </w:r>
+            <w:r>
+              <w:rPr>
+                <w:b/>
+                <w:sz w:val="18"/>
+              </w:rPr>
+              <w:t>CipEquipment</w:t>
+            </w:r>
+            <w:r>
+              <w:rPr>
+                <w:sz w:val="18"/>
+              </w:rPr>
+              <w:t>)</w:t>
+            </w:r>
+          </w:p>
+        </w:tc>
+        <w:tc>
+          <w:tcPr>
+            <w:tcW w:type="dxa" w:w="4824"/>
+            <w:shd w:val="clear" w:color="auto" w:fill="EEF2F8"/>
+            <w:tcMar>
+              <w:top w:w="60" w:type="dxa"/>
+              <w:bottom w:w="60" w:type="dxa"/>
+              <w:start w:w="110" w:type="dxa"/>
+              <w:end w:w="110" w:type="dxa"/>
+            </w:tcMar>
+          </w:tcPr>
+          <w:p>
+            <w:pPr>
+              <w:spacing w:after="0"/>
+            </w:pPr>
+            <w:r>
+              <w:rPr>
+                <w:sz w:val="18"/>
+              </w:rPr>
+              <w:t xml:space="preserve">Danh mục thiết bị vệ sinh: </w:t>
+            </w:r>
+            <w:r>
+              <w:rPr>
+                <w:rFonts w:ascii="Consolas" w:hAnsi="Consolas"/>
+                <w:color w:val="B03A2E"/>
+                <w:sz w:val="19"/>
+              </w:rPr>
+              <w:t>code</w:t>
+            </w:r>
+            <w:r>
+              <w:rPr>
+                <w:sz w:val="18"/>
+              </w:rPr>
+              <w:t>/</w:t>
+            </w:r>
+            <w:r>
+              <w:rPr>
+                <w:rFonts w:ascii="Consolas" w:hAnsi="Consolas"/>
+                <w:color w:val="B03A2E"/>
+                <w:sz w:val="19"/>
+              </w:rPr>
+              <w:t>name</w:t>
+            </w:r>
+            <w:r>
+              <w:rPr>
+                <w:sz w:val="18"/>
+              </w:rPr>
+              <w:t>/</w:t>
+            </w:r>
+            <w:r>
+              <w:rPr>
+                <w:rFonts w:ascii="Consolas" w:hAnsi="Consolas"/>
+                <w:color w:val="B03A2E"/>
+                <w:sz w:val="19"/>
+              </w:rPr>
+              <w:t>area</w:t>
+            </w:r>
+            <w:r>
+              <w:rPr>
+                <w:sz w:val="18"/>
+              </w:rPr>
+              <w:t xml:space="preserve">, </w:t>
+            </w:r>
+            <w:r>
+              <w:rPr>
+                <w:rFonts w:ascii="Consolas" w:hAnsi="Consolas"/>
+                <w:color w:val="B03A2E"/>
+                <w:sz w:val="19"/>
+              </w:rPr>
+              <w:t>production_line_id</w:t>
+            </w:r>
+            <w:r>
+              <w:rPr>
+                <w:sz w:val="18"/>
+              </w:rPr>
+              <w:t xml:space="preserve"> FK optional tới </w:t>
+            </w:r>
+            <w:r>
+              <w:rPr>
+                <w:rFonts w:ascii="Consolas" w:hAnsi="Consolas"/>
+                <w:color w:val="B03A2E"/>
+                <w:sz w:val="19"/>
+              </w:rPr>
+              <w:t>production_line</w:t>
+            </w:r>
+            <w:r>
+              <w:rPr>
+                <w:sz w:val="18"/>
+              </w:rPr>
+              <w:t xml:space="preserve"> (gắn đúng 1 tank/dây chuyền nếu có, để lọc gợi ý theo mã thiết bị thực tế; để trống với thiết bị dùng chung như đường ống/máy nghiền)</w:t>
+            </w:r>
+          </w:p>
+        </w:tc>
+      </w:tr>
+      <w:tr>
+        <w:tc>
+          <w:tcPr>
+            <w:tcW w:type="dxa" w:w="4824"/>
+            <w:tcMar>
+              <w:top w:w="60" w:type="dxa"/>
+              <w:bottom w:w="60" w:type="dxa"/>
+              <w:start w:w="110" w:type="dxa"/>
+              <w:end w:w="110" w:type="dxa"/>
+            </w:tcMar>
+          </w:tcPr>
+          <w:p>
+            <w:pPr>
+              <w:spacing w:after="0"/>
+            </w:pPr>
+            <w:r>
+              <w:rPr>
+                <w:rFonts w:ascii="Consolas" w:hAnsi="Consolas"/>
+                <w:color w:val="B03A2E"/>
+                <w:sz w:val="19"/>
+              </w:rPr>
+              <w:t>cip_record</w:t>
+            </w:r>
+            <w:r>
+              <w:rPr>
+                <w:sz w:val="18"/>
+              </w:rPr>
+              <w:t xml:space="preserve"> (</w:t>
+            </w:r>
+            <w:r>
+              <w:rPr>
+                <w:b/>
+                <w:sz w:val="18"/>
+              </w:rPr>
+              <w:t>CipRecord</w:t>
+            </w:r>
+            <w:r>
+              <w:rPr>
+                <w:sz w:val="18"/>
+              </w:rPr>
+              <w:t>)</w:t>
+            </w:r>
+          </w:p>
+        </w:tc>
+        <w:tc>
+          <w:tcPr>
+            <w:tcW w:type="dxa" w:w="4824"/>
+            <w:tcMar>
+              <w:top w:w="60" w:type="dxa"/>
+              <w:bottom w:w="60" w:type="dxa"/>
+              <w:start w:w="110" w:type="dxa"/>
+              <w:end w:w="110" w:type="dxa"/>
+            </w:tcMar>
+          </w:tcPr>
+          <w:p>
+            <w:pPr>
+              <w:spacing w:after="0"/>
+            </w:pPr>
+            <w:r>
+              <w:rPr>
+                <w:sz w:val="18"/>
+              </w:rPr>
+              <w:t xml:space="preserve">1 lần vệ sinh: </w:t>
+            </w:r>
+            <w:r>
+              <w:rPr>
+                <w:rFonts w:ascii="Consolas" w:hAnsi="Consolas"/>
+                <w:color w:val="B03A2E"/>
+                <w:sz w:val="19"/>
+              </w:rPr>
+              <w:t>cip_code</w:t>
+            </w:r>
+            <w:r>
+              <w:rPr>
+                <w:sz w:val="18"/>
+              </w:rPr>
+              <w:t xml:space="preserve"> (auto </w:t>
+            </w:r>
+            <w:r>
+              <w:rPr>
+                <w:rFonts w:ascii="Consolas" w:hAnsi="Consolas"/>
+                <w:color w:val="B03A2E"/>
+                <w:sz w:val="19"/>
+              </w:rPr>
+              <w:t>"CIP-2026-00001"</w:t>
+            </w:r>
+            <w:r>
+              <w:rPr>
+                <w:sz w:val="18"/>
+              </w:rPr>
+              <w:t xml:space="preserve">), </w:t>
+            </w:r>
+            <w:r>
+              <w:rPr>
+                <w:rFonts w:ascii="Consolas" w:hAnsi="Consolas"/>
+                <w:color w:val="B03A2E"/>
+                <w:sz w:val="19"/>
+              </w:rPr>
+              <w:t>form_type_id</w:t>
+            </w:r>
+            <w:r>
+              <w:rPr>
+                <w:sz w:val="18"/>
+              </w:rPr>
+              <w:t>/</w:t>
+            </w:r>
+            <w:r>
+              <w:rPr>
+                <w:rFonts w:ascii="Consolas" w:hAnsi="Consolas"/>
+                <w:color w:val="B03A2E"/>
+                <w:sz w:val="19"/>
+              </w:rPr>
+              <w:t>equipment_id</w:t>
+            </w:r>
+            <w:r>
+              <w:rPr>
+                <w:sz w:val="18"/>
+              </w:rPr>
+              <w:t xml:space="preserve"> FK, </w:t>
+            </w:r>
+            <w:r>
+              <w:rPr>
+                <w:rFonts w:ascii="Consolas" w:hAnsi="Consolas"/>
+                <w:color w:val="B03A2E"/>
+                <w:sz w:val="19"/>
+              </w:rPr>
+              <w:t>batch_number</w:t>
+            </w:r>
+            <w:r>
+              <w:rPr>
+                <w:sz w:val="18"/>
+              </w:rPr>
+              <w:t>/</w:t>
+            </w:r>
+            <w:r>
+              <w:rPr>
+                <w:rFonts w:ascii="Consolas" w:hAnsi="Consolas"/>
+                <w:color w:val="B03A2E"/>
+                <w:sz w:val="19"/>
+              </w:rPr>
+              <w:t>order_number</w:t>
+            </w:r>
+            <w:r>
+              <w:rPr>
+                <w:sz w:val="18"/>
+              </w:rPr>
+              <w:t xml:space="preserve"> bắt buộc (đối chiếu ngược Batch/Order Number Braumat — cùng khái niệm dùng ở Ghi chép nấu/Lên men), </w:t>
+            </w:r>
+            <w:r>
+              <w:rPr>
+                <w:rFonts w:ascii="Consolas" w:hAnsi="Consolas"/>
+                <w:color w:val="B03A2E"/>
+                <w:sz w:val="19"/>
+              </w:rPr>
+              <w:t>shift</w:t>
+            </w:r>
+            <w:r>
+              <w:rPr>
+                <w:sz w:val="18"/>
+              </w:rPr>
+              <w:t xml:space="preserve">, </w:t>
+            </w:r>
+            <w:r>
+              <w:rPr>
+                <w:rFonts w:ascii="Consolas" w:hAnsi="Consolas"/>
+                <w:color w:val="B03A2E"/>
+                <w:sz w:val="19"/>
+              </w:rPr>
+              <w:t>started_at</w:t>
+            </w:r>
+            <w:r>
+              <w:rPr>
+                <w:sz w:val="18"/>
+              </w:rPr>
+              <w:t>/</w:t>
+            </w:r>
+            <w:r>
+              <w:rPr>
+                <w:rFonts w:ascii="Consolas" w:hAnsi="Consolas"/>
+                <w:color w:val="B03A2E"/>
+                <w:sz w:val="19"/>
+              </w:rPr>
+              <w:t>ended_at</w:t>
+            </w:r>
+            <w:r>
+              <w:rPr>
+                <w:sz w:val="18"/>
+              </w:rPr>
+              <w:t xml:space="preserve">, </w:t>
+            </w:r>
+            <w:r>
+              <w:rPr>
+                <w:rFonts w:ascii="Consolas" w:hAnsi="Consolas"/>
+                <w:color w:val="B03A2E"/>
+                <w:sz w:val="19"/>
+              </w:rPr>
+              <w:t>performed_by</w:t>
+            </w:r>
+            <w:r>
+              <w:rPr>
+                <w:sz w:val="18"/>
+              </w:rPr>
+              <w:t xml:space="preserve">, </w:t>
+            </w:r>
+            <w:r>
+              <w:rPr>
+                <w:rFonts w:ascii="Consolas" w:hAnsi="Consolas"/>
+                <w:color w:val="B03A2E"/>
+                <w:sz w:val="19"/>
+              </w:rPr>
+              <w:t>duty_officer</w:t>
+            </w:r>
+            <w:r>
+              <w:rPr>
+                <w:sz w:val="18"/>
+              </w:rPr>
+              <w:t xml:space="preserve">, </w:t>
+            </w:r>
+            <w:r>
+              <w:rPr>
+                <w:rFonts w:ascii="Consolas" w:hAnsi="Consolas"/>
+                <w:color w:val="B03A2E"/>
+                <w:sz w:val="19"/>
+              </w:rPr>
+              <w:t>steps</w:t>
+            </w:r>
+            <w:r>
+              <w:rPr>
+                <w:sz w:val="18"/>
+              </w:rPr>
+              <w:t xml:space="preserve"> (JSON linh hoạt — mỗi dòng có 4 trường TIÊU CHUẨN khoá copy từ </w:t>
+            </w:r>
+            <w:r>
+              <w:rPr>
+                <w:rFonts w:ascii="Consolas" w:hAnsi="Consolas"/>
+                <w:color w:val="B03A2E"/>
+                <w:sz w:val="19"/>
+              </w:rPr>
+              <w:t>default_steps</w:t>
+            </w:r>
+            <w:r>
+              <w:rPr>
+                <w:sz w:val="18"/>
+              </w:rPr>
+              <w:t xml:space="preserve"> + 4 trường </w:t>
+            </w:r>
+            <w:r>
+              <w:rPr>
+                <w:rFonts w:ascii="Consolas" w:hAnsi="Consolas"/>
+                <w:color w:val="B03A2E"/>
+                <w:sz w:val="19"/>
+              </w:rPr>
+              <w:t>*_actual</w:t>
+            </w:r>
+            <w:r>
+              <w:rPr>
+                <w:sz w:val="18"/>
+              </w:rPr>
+              <w:t xml:space="preserve"> THỰC TẾ người vận hành tự nhập), </w:t>
+            </w:r>
+            <w:r>
+              <w:rPr>
+                <w:rFonts w:ascii="Consolas" w:hAnsi="Consolas"/>
+                <w:color w:val="B03A2E"/>
+                <w:sz w:val="19"/>
+              </w:rPr>
+              <w:t>result</w:t>
+            </w:r>
+            <w:r>
+              <w:rPr>
+                <w:sz w:val="18"/>
+              </w:rPr>
+              <w:t xml:space="preserve"> (dat\</w:t>
+            </w:r>
+          </w:p>
+        </w:tc>
+      </w:tr>
+      <w:tr>
+        <w:tc>
+          <w:tcPr>
+            <w:tcW w:type="dxa" w:w="4824"/>
+            <w:shd w:val="clear" w:color="auto" w:fill="EEF2F8"/>
+            <w:tcMar>
+              <w:top w:w="60" w:type="dxa"/>
+              <w:bottom w:w="60" w:type="dxa"/>
+              <w:start w:w="110" w:type="dxa"/>
+              <w:end w:w="110" w:type="dxa"/>
+            </w:tcMar>
+          </w:tcPr>
+          <w:p>
+            <w:pPr>
+              <w:spacing w:after="0"/>
+            </w:pPr>
+            <w:r>
+              <w:rPr>
+                <w:rFonts w:ascii="Consolas" w:hAnsi="Consolas"/>
+                <w:color w:val="B03A2E"/>
+                <w:sz w:val="19"/>
+              </w:rPr>
+              <w:t>cip_link</w:t>
+            </w:r>
+            <w:r>
+              <w:rPr>
+                <w:sz w:val="18"/>
+              </w:rPr>
+              <w:t xml:space="preserve"> (</w:t>
+            </w:r>
+            <w:r>
+              <w:rPr>
+                <w:b/>
+                <w:sz w:val="18"/>
+              </w:rPr>
+              <w:t>CipLink</w:t>
+            </w:r>
+            <w:r>
+              <w:rPr>
+                <w:sz w:val="18"/>
+              </w:rPr>
+              <w:t xml:space="preserve">, unique trên </w:t>
+            </w:r>
+            <w:r>
+              <w:rPr>
+                <w:rFonts w:ascii="Consolas" w:hAnsi="Consolas"/>
+                <w:color w:val="B03A2E"/>
+                <w:sz w:val="19"/>
+              </w:rPr>
+              <w:t>cip_id+scope_type+scope_id</w:t>
+            </w:r>
+            <w:r>
+              <w:rPr>
+                <w:sz w:val="18"/>
+              </w:rPr>
+              <w:t>)</w:t>
+            </w:r>
+          </w:p>
+        </w:tc>
+        <w:tc>
+          <w:tcPr>
+            <w:tcW w:type="dxa" w:w="4824"/>
+            <w:shd w:val="clear" w:color="auto" w:fill="EEF2F8"/>
+            <w:tcMar>
+              <w:top w:w="60" w:type="dxa"/>
+              <w:bottom w:w="60" w:type="dxa"/>
+              <w:start w:w="110" w:type="dxa"/>
+              <w:end w:w="110" w:type="dxa"/>
+            </w:tcMar>
+          </w:tcPr>
+          <w:p>
+            <w:pPr>
+              <w:spacing w:after="0"/>
+            </w:pPr>
+            <w:r>
+              <w:rPr>
+                <w:sz w:val="18"/>
+              </w:rPr>
+              <w:t xml:space="preserve">Gắn TAY (không tự suy đoán) 1 </w:t>
+            </w:r>
+            <w:r>
+              <w:rPr>
+                <w:rFonts w:ascii="Consolas" w:hAnsi="Consolas"/>
+                <w:color w:val="B03A2E"/>
+                <w:sz w:val="19"/>
+              </w:rPr>
+              <w:t>CipRecord</w:t>
+            </w:r>
+            <w:r>
+              <w:rPr>
+                <w:sz w:val="18"/>
+              </w:rPr>
+              <w:t xml:space="preserve"> với mẻ/lô — cùng vocabulary </w:t>
+            </w:r>
+            <w:r>
+              <w:rPr>
+                <w:rFonts w:ascii="Consolas" w:hAnsi="Consolas"/>
+                <w:color w:val="B03A2E"/>
+                <w:sz w:val="19"/>
+              </w:rPr>
+              <w:t>scope_type</w:t>
+            </w:r>
+            <w:r>
+              <w:rPr>
+                <w:sz w:val="18"/>
+              </w:rPr>
+              <w:t xml:space="preserve"> đã dùng ở Hold/Deviation trong </w:t>
+            </w:r>
+            <w:r>
+              <w:rPr>
+                <w:rFonts w:ascii="Consolas" w:hAnsi="Consolas"/>
+                <w:color w:val="B03A2E"/>
+                <w:sz w:val="19"/>
+              </w:rPr>
+              <w:t>services/quality.py</w:t>
+            </w:r>
+            <w:r>
+              <w:rPr>
+                <w:sz w:val="18"/>
+              </w:rPr>
+              <w:t xml:space="preserve"> (brew_batch\</w:t>
+            </w:r>
+          </w:p>
+        </w:tc>
+      </w:tr>
+    </w:tbl>
+    <w:p>
+      <w:pPr>
+        <w:spacing w:after="40"/>
+      </w:pPr>
+    </w:p>
+    <w:p>
+      <w:r>
+        <w:rPr>
+          <w:b/>
+        </w:rPr>
+        <w:t>Quyền:</w:t>
+      </w:r>
+      <w:r>
+        <w:t xml:space="preserve"> </w:t>
+      </w:r>
+      <w:r>
+        <w:rPr>
+          <w:rFonts w:ascii="Consolas" w:hAnsi="Consolas"/>
+          <w:color w:val="B03A2E"/>
+          <w:sz w:val="19"/>
+        </w:rPr>
+        <w:t>cip.manage</w:t>
+      </w:r>
+      <w:r>
+        <w:t xml:space="preserve"> (permission mới trong </w:t>
+      </w:r>
+      <w:r>
+        <w:rPr>
+          <w:rFonts w:ascii="Consolas" w:hAnsi="Consolas"/>
+          <w:color w:val="B03A2E"/>
+          <w:sz w:val="19"/>
+        </w:rPr>
+        <w:t>PERMISSION_CATALOG</w:t>
+      </w:r>
+      <w:r>
+        <w:t xml:space="preserve"> — xem §8.3, tổng permission catalog hiện có </w:t>
+      </w:r>
+      <w:r>
+        <w:rPr>
+          <w:b/>
+        </w:rPr>
+        <w:t>23 mục</w:t>
+      </w:r>
+      <w:r>
+        <w:t>).</w:t>
+      </w:r>
+    </w:p>
+    <w:p>
+      <w:r>
+        <w:rPr>
+          <w:b/>
+        </w:rPr>
+        <w:t>Endpoints chính</w:t>
+      </w:r>
+      <w:r>
+        <w:t xml:space="preserve"> (</w:t>
+      </w:r>
+      <w:r>
+        <w:rPr>
+          <w:rFonts w:ascii="Consolas" w:hAnsi="Consolas"/>
+          <w:color w:val="B03A2E"/>
+          <w:sz w:val="19"/>
+        </w:rPr>
+        <w:t>routers/cip.py</w:t>
+      </w:r>
+      <w:r>
+        <w:t xml:space="preserve">, prefix </w:t>
+      </w:r>
+      <w:r>
+        <w:rPr>
+          <w:rFonts w:ascii="Consolas" w:hAnsi="Consolas"/>
+          <w:color w:val="B03A2E"/>
+          <w:sz w:val="19"/>
+        </w:rPr>
+        <w:t>/api/cip</w:t>
+      </w:r>
+      <w:r>
+        <w:t xml:space="preserve">): </w:t>
+      </w:r>
+      <w:r>
+        <w:rPr>
+          <w:rFonts w:ascii="Consolas" w:hAnsi="Consolas"/>
+          <w:color w:val="B03A2E"/>
+          <w:sz w:val="19"/>
+        </w:rPr>
+        <w:t>GET/POST /form-types</w:t>
+      </w:r>
+      <w:r>
+        <w:t xml:space="preserve">, </w:t>
+      </w:r>
+      <w:r>
+        <w:rPr>
+          <w:rFonts w:ascii="Consolas" w:hAnsi="Consolas"/>
+          <w:color w:val="B03A2E"/>
+          <w:sz w:val="19"/>
+        </w:rPr>
+        <w:t>PUT/DELETE /form-types/{id}</w:t>
+      </w:r>
+      <w:r>
+        <w:t xml:space="preserve">, </w:t>
+      </w:r>
+      <w:r>
+        <w:rPr>
+          <w:rFonts w:ascii="Consolas" w:hAnsi="Consolas"/>
+          <w:color w:val="B03A2E"/>
+          <w:sz w:val="19"/>
+        </w:rPr>
+        <w:t>POST /form-types/{id}/copy-steps</w:t>
+      </w:r>
+      <w:r>
+        <w:t xml:space="preserve"> (copy bảng bước mẫu từ 1 form-type sang form-type khác, </w:t>
+      </w:r>
+      <w:r>
+        <w:rPr>
+          <w:b/>
+        </w:rPr>
+        <w:t>chỉ khi đích đang có bảng bước rỗng</w:t>
+      </w:r>
+      <w:r>
+        <w:t xml:space="preserve"> — tránh ghi đè nhầm, chặn 409 nếu đích không trống hoặc trùng nguồn), </w:t>
+      </w:r>
+      <w:r>
+        <w:rPr>
+          <w:rFonts w:ascii="Consolas" w:hAnsi="Consolas"/>
+          <w:color w:val="B03A2E"/>
+          <w:sz w:val="19"/>
+        </w:rPr>
+        <w:t>GET/POST /equipment</w:t>
+      </w:r>
+      <w:r>
+        <w:t xml:space="preserve">, </w:t>
+      </w:r>
+      <w:r>
+        <w:rPr>
+          <w:rFonts w:ascii="Consolas" w:hAnsi="Consolas"/>
+          <w:color w:val="B03A2E"/>
+          <w:sz w:val="19"/>
+        </w:rPr>
+        <w:t>PUT/DELETE /equipment/{id}</w:t>
+      </w:r>
+      <w:r>
+        <w:t xml:space="preserve">, </w:t>
+      </w:r>
+      <w:r>
+        <w:rPr>
+          <w:rFonts w:ascii="Consolas" w:hAnsi="Consolas"/>
+          <w:color w:val="B03A2E"/>
+          <w:sz w:val="19"/>
+        </w:rPr>
+        <w:t>GET/POST /records</w:t>
+      </w:r>
+      <w:r>
+        <w:t xml:space="preserve">, </w:t>
+      </w:r>
+      <w:r>
+        <w:rPr>
+          <w:rFonts w:ascii="Consolas" w:hAnsi="Consolas"/>
+          <w:color w:val="B03A2E"/>
+          <w:sz w:val="19"/>
+        </w:rPr>
+        <w:t>GET/PUT /records/{cip_id}</w:t>
+      </w:r>
+      <w:r>
+        <w:t xml:space="preserve">, </w:t>
+      </w:r>
+      <w:r>
+        <w:rPr>
+          <w:rFonts w:ascii="Consolas" w:hAnsi="Consolas"/>
+          <w:color w:val="B03A2E"/>
+          <w:sz w:val="19"/>
+        </w:rPr>
+        <w:t>POST /records/{cip_id}/approve</w:t>
+      </w:r>
+      <w:r>
+        <w:t xml:space="preserve">, </w:t>
+      </w:r>
+      <w:r>
+        <w:rPr>
+          <w:rFonts w:ascii="Consolas" w:hAnsi="Consolas"/>
+          <w:color w:val="B03A2E"/>
+          <w:sz w:val="19"/>
+        </w:rPr>
+        <w:t>GET /suggest</w:t>
+      </w:r>
+      <w:r>
+        <w:t xml:space="preserve"> (gợi ý form-type/equipment theo scope), </w:t>
+      </w:r>
+      <w:r>
+        <w:rPr>
+          <w:rFonts w:ascii="Consolas" w:hAnsi="Consolas"/>
+          <w:color w:val="B03A2E"/>
+          <w:sz w:val="19"/>
+        </w:rPr>
+        <w:t>GET/POST/DELETE /links</w:t>
+      </w:r>
+      <w:r>
+        <w:t>.</w:t>
+      </w:r>
+    </w:p>
+    <w:p>
+      <w:r>
+        <w:rPr>
+          <w:b/>
+        </w:rPr>
+        <w:t>Frontend</w:t>
+      </w:r>
+      <w:r>
+        <w:t xml:space="preserve"> (</w:t>
+      </w:r>
+      <w:r>
+        <w:rPr>
+          <w:rFonts w:ascii="Consolas" w:hAnsi="Consolas"/>
+          <w:color w:val="B03A2E"/>
+          <w:sz w:val="19"/>
+        </w:rPr>
+        <w:t>views_ext.js</w:t>
+      </w:r>
+      <w:r>
+        <w:t>): module CIP có 3 tab — "Danh mục" (form-types + equipment), "Khai báo biểu mẫu" (soạn bảng bước mẫu Tiêu chuẩn cho từng loại biểu mẫu, có ô N/A cho time/temp/conc khi bước đó không cần ghi; nút "Copy sang biểu mẫu khác"), "Khai báo CIP" (tạo 1 lần vệ sinh mới — chọn form-type tự điền bảng Tiêu chuẩn khoá, nhập cột Thực tế bên cạnh; trường "TH:Kết quả" là dropdown Đạt/Không đạt). Nút "Gắn CIP liên quan" (</w:t>
+      </w:r>
+      <w:r>
+        <w:rPr>
+          <w:rFonts w:ascii="Consolas" w:hAnsi="Consolas"/>
+          <w:color w:val="B03A2E"/>
+          <w:sz w:val="19"/>
+        </w:rPr>
+        <w:t>app.js</w:t>
+      </w:r>
+      <w:r>
+        <w:t>) gắn vào 4 loại thực thể: mẻ nấu, mẻ lên men, mẻ lọc, mẻ chiết. Có báo cáo/in xem Tiêu chuẩn vs Thực tế. CIP link cũng được đưa vào Hồ sơ điện tử (</w:t>
+      </w:r>
+      <w:r>
+        <w:rPr>
+          <w:rFonts w:ascii="Consolas" w:hAnsi="Consolas"/>
+          <w:color w:val="B03A2E"/>
+          <w:sz w:val="19"/>
+        </w:rPr>
+        <w:t>services/lot_record.py</w:t>
+      </w:r>
+      <w:r>
+        <w:t xml:space="preserve"> aggregator) và vào Audit trail.</w:t>
+      </w:r>
+    </w:p>
+    <w:p>
+      <w:pPr>
         <w:pStyle w:val="Heading2"/>
       </w:pPr>
       <w:r>
@@ -10479,7 +11990,7 @@
           <w:color w:val="333333"/>
           <w:sz w:val="17"/>
         </w:rPr>
-        <w:t xml:space="preserve">   → Lọc vào BBT theo thể tích kế hoạch từng tank → Duyệt Lọc (KCS)</w:t>
+        <w:t xml:space="preserve">   → Lọc vào BBT theo thể tích kế hoạch từng tank → mẻ lọc kết thúc chuyển trạng thái</w:t>
       </w:r>
       <w:r>
         <w:br/>
@@ -10490,7 +12001,7 @@
           <w:color w:val="333333"/>
           <w:sz w:val="17"/>
         </w:rPr>
-        <w:t>Chiết (theo ca 1/2/3, nhiều dây chuyền, gắn SKU thành phẩm) → Kết thúc mẻ (nhập ca1/2/3 thật)</w:t>
+        <w:t xml:space="preserve">     **"Chờ duyệt"** (trước gọi "Chờ chiết") → Duyệt Lọc (KCS)</w:t>
       </w:r>
       <w:r>
         <w:br/>
@@ -10501,7 +12012,7 @@
           <w:color w:val="333333"/>
           <w:sz w:val="17"/>
         </w:rPr>
-        <w:t xml:space="preserve">   → Duyệt Chiết (quality.release) → tự sinh N FinishedGoodsUnit vào WMS</w:t>
+        <w:t>Chiết (theo ca 1/2/3, nhiều dây chuyền, gắn SKU thành phẩm) → Kết thúc mẻ (nhập ca1/2/3 thật)</w:t>
       </w:r>
       <w:r>
         <w:br/>
@@ -10512,7 +12023,7 @@
           <w:color w:val="333333"/>
           <w:sz w:val="17"/>
         </w:rPr>
-        <w:t>WMS: Cất vào vị trí / Điều chuyển / Phân rã theo lô / Xuất kho (cart FIFO, theo Lệnh đóng hàng</w:t>
+        <w:t xml:space="preserve">   → Duyệt Chiết (quality.release) → tự sinh N FinishedGoodsUnit vào WMS</w:t>
       </w:r>
       <w:r>
         <w:br/>
@@ -10523,72 +12034,18 @@
           <w:color w:val="333333"/>
           <w:sz w:val="17"/>
         </w:rPr>
-        <w:t xml:space="preserve">   hoặc thủ công) / Xuất tự do (admin) → Shipment (có loại xuất, kiểm tra FIFO)</w:t>
-      </w:r>
-    </w:p>
-    <w:p>
-      <w:pPr>
-        <w:pStyle w:val="Heading3"/>
-      </w:pPr>
-      <w:r>
-        <w:t>7.3 Luồng Kho NVL 2 địa điểm</w:t>
-      </w:r>
-    </w:p>
-    <w:p>
-      <w:pPr>
-        <w:ind w:left="160"/>
-      </w:pPr>
+        <w:t>WMS: Cất vào vị trí / Điều chuyển / Phân rã theo lô / Xuất kho (cart FIFO, theo Lệnh đóng hàng</w:t>
+      </w:r>
+      <w:r>
+        <w:br/>
+      </w:r>
       <w:r>
         <w:rPr>
           <w:rFonts w:ascii="Consolas" w:hAnsi="Consolas"/>
           <w:color w:val="333333"/>
           <w:sz w:val="17"/>
         </w:rPr>
-        <w:t>Nhập kho (NCC → Kho công ty, mặc định) → thủ kho quản lý tồn tại Kho công ty</w:t>
-      </w:r>
-      <w:r>
-        <w:br/>
-      </w:r>
-      <w:r>
-        <w:rPr>
-          <w:rFonts w:ascii="Consolas" w:hAnsi="Consolas"/>
-          <w:color w:val="333333"/>
-          <w:sz w:val="17"/>
-        </w:rPr>
-        <w:t>Kho phân xưởng đề nghị nhận NVL (Đề nghị nhận kho, theo Lệnh nấu/Lệnh lọc chưa hoàn thành)</w:t>
-      </w:r>
-      <w:r>
-        <w:br/>
-      </w:r>
-      <w:r>
-        <w:rPr>
-          <w:rFonts w:ascii="Consolas" w:hAnsi="Consolas"/>
-          <w:color w:val="333333"/>
-          <w:sz w:val="17"/>
-        </w:rPr>
-        <w:t xml:space="preserve">   → Kho công ty duyệt/fulfill từng dòng (FIFO) → chuyển vật lý sang Kho phân xưởng</w:t>
-      </w:r>
-      <w:r>
-        <w:br/>
-      </w:r>
-      <w:r>
-        <w:rPr>
-          <w:rFonts w:ascii="Consolas" w:hAnsi="Consolas"/>
-          <w:color w:val="333333"/>
-          <w:sz w:val="17"/>
-        </w:rPr>
-        <w:t>Kho phân xưởng tiêu thụ NVL trực tiếp cho mẻ nấu/lọc (trừ tồn ngay tại Kho phân xưởng)</w:t>
-      </w:r>
-      <w:r>
-        <w:br/>
-      </w:r>
-      <w:r>
-        <w:rPr>
-          <w:rFonts w:ascii="Consolas" w:hAnsi="Consolas"/>
-          <w:color w:val="333333"/>
-          <w:sz w:val="17"/>
-        </w:rPr>
-        <w:t>Kiểm kê định kỳ độc lập ở mỗi địa điểm (location filter riêng)</w:t>
+        <w:t xml:space="preserve">   hoặc thủ công) / Xuất tự do (admin) → Shipment (có loại xuất, kiểm tra FIFO)</w:t>
       </w:r>
     </w:p>
     <w:p>
@@ -10598,25 +12055,18 @@
       </w:pPr>
       <w:r>
         <w:rPr>
-          <w:i/>
-          <w:color w:val="555555"/>
-        </w:rPr>
-        <w:t xml:space="preserve">Xem </w:t>
-      </w:r>
-      <w:r>
-        <w:rPr>
           <w:b/>
           <w:i/>
           <w:color w:val="555555"/>
         </w:rPr>
-        <w:t>§8.7</w:t>
+        <w:t>Lọc — mẻ lọc nhỏ độc lập</w:t>
       </w:r>
       <w:r>
         <w:rPr>
           <w:i/>
           <w:color w:val="555555"/>
         </w:rPr>
-        <w:t xml:space="preserve"> — địa điểm là dữ liệu (chuỗi </w:t>
+        <w:t xml:space="preserve">: cho phép trùng </w:t>
       </w:r>
       <w:r>
         <w:rPr>
@@ -10625,14 +12075,62 @@
           <w:color w:val="555555"/>
           <w:sz w:val="19"/>
         </w:rPr>
-        <w:t>location</w:t>
+        <w:t>batch_number</w:t>
       </w:r>
       <w:r>
         <w:rPr>
           <w:i/>
           <w:color w:val="555555"/>
         </w:rPr>
-        <w:t xml:space="preserve">), </w:t>
+        <w:t>/</w:t>
+      </w:r>
+      <w:r>
+        <w:rPr>
+          <w:rFonts w:ascii="Consolas" w:hAnsi="Consolas"/>
+          <w:i/>
+          <w:color w:val="555555"/>
+          <w:sz w:val="19"/>
+        </w:rPr>
+        <w:t>order_number</w:t>
+      </w:r>
+      <w:r>
+        <w:rPr>
+          <w:i/>
+          <w:color w:val="555555"/>
+        </w:rPr>
+        <w:t xml:space="preserve"> giữa các lệnh lọc khác nhau; báo cáo sản lượng gộp theo </w:t>
+      </w:r>
+      <w:r>
+        <w:rPr>
+          <w:rFonts w:ascii="Consolas" w:hAnsi="Consolas"/>
+          <w:i/>
+          <w:color w:val="555555"/>
+          <w:sz w:val="19"/>
+        </w:rPr>
+        <w:t>(batch_number, order_number, batch_seq_no)</w:t>
+      </w:r>
+      <w:r>
+        <w:rPr>
+          <w:i/>
+          <w:color w:val="555555"/>
+        </w:rPr>
+        <w:t xml:space="preserve">; </w:t>
+      </w:r>
+      <w:r>
+        <w:rPr>
+          <w:rFonts w:ascii="Consolas" w:hAnsi="Consolas"/>
+          <w:i/>
+          <w:color w:val="555555"/>
+          <w:sz w:val="19"/>
+        </w:rPr>
+        <w:t>is_final_batch</w:t>
+      </w:r>
+      <w:r>
+        <w:rPr>
+          <w:i/>
+          <w:color w:val="555555"/>
+        </w:rPr>
+        <w:t xml:space="preserve"> loại "mẻ cuối" khỏi phân loại Thấp/Cao sản lượng. </w:t>
       </w:r>
       <w:r>
         <w:rPr>
@@ -10640,14 +12138,30 @@
           <w:i/>
           <w:color w:val="555555"/>
         </w:rPr>
-        <w:t>không phải</w:t>
+        <w:t>Hồ sơ điện tử</w:t>
       </w:r>
       <w:r>
         <w:rPr>
           <w:i/>
           <w:color w:val="555555"/>
         </w:rPr>
-        <w:t xml:space="preserve"> một chiều phân quyền riêng.</w:t>
+        <w:t xml:space="preserve"> (</w:t>
+      </w:r>
+      <w:r>
+        <w:rPr>
+          <w:rFonts w:ascii="Consolas" w:hAnsi="Consolas"/>
+          <w:i/>
+          <w:color w:val="555555"/>
+          <w:sz w:val="19"/>
+        </w:rPr>
+        <w:t>services/lot_record.py</w:t>
+      </w:r>
+      <w:r>
+        <w:rPr>
+          <w:i/>
+          <w:color w:val="555555"/>
+        </w:rPr>
+        <w:t>) liệt kê đầy đủ từng "mẻ lọc số" (tank nguồn, thể tích, thời điểm kết thúc) dưới mỗi mẻ lọc, không chỉ tổng hợp cấp bản ghi.</w:t>
       </w:r>
     </w:p>
     <w:p>
@@ -10655,6 +12169,130 @@
         <w:pStyle w:val="Heading3"/>
       </w:pPr>
       <w:r>
+        <w:t>7.3 Luồng Kho NVL 2 địa điểm</w:t>
+      </w:r>
+    </w:p>
+    <w:p>
+      <w:pPr>
+        <w:ind w:left="160"/>
+      </w:pPr>
+      <w:r>
+        <w:rPr>
+          <w:rFonts w:ascii="Consolas" w:hAnsi="Consolas"/>
+          <w:color w:val="333333"/>
+          <w:sz w:val="17"/>
+        </w:rPr>
+        <w:t>Nhập kho (NCC → Kho công ty, mặc định) → thủ kho quản lý tồn tại Kho công ty</w:t>
+      </w:r>
+      <w:r>
+        <w:br/>
+      </w:r>
+      <w:r>
+        <w:rPr>
+          <w:rFonts w:ascii="Consolas" w:hAnsi="Consolas"/>
+          <w:color w:val="333333"/>
+          <w:sz w:val="17"/>
+        </w:rPr>
+        <w:t>Kho phân xưởng đề nghị nhận NVL (Đề nghị nhận kho, theo Lệnh nấu/Lệnh lọc chưa hoàn thành)</w:t>
+      </w:r>
+      <w:r>
+        <w:br/>
+      </w:r>
+      <w:r>
+        <w:rPr>
+          <w:rFonts w:ascii="Consolas" w:hAnsi="Consolas"/>
+          <w:color w:val="333333"/>
+          <w:sz w:val="17"/>
+        </w:rPr>
+        <w:t xml:space="preserve">   → Kho công ty duyệt/fulfill từng dòng (FIFO) → chuyển vật lý sang Kho phân xưởng</w:t>
+      </w:r>
+      <w:r>
+        <w:br/>
+      </w:r>
+      <w:r>
+        <w:rPr>
+          <w:rFonts w:ascii="Consolas" w:hAnsi="Consolas"/>
+          <w:color w:val="333333"/>
+          <w:sz w:val="17"/>
+        </w:rPr>
+        <w:t>Kho phân xưởng tiêu thụ NVL trực tiếp cho mẻ nấu/lọc (trừ tồn ngay tại Kho phân xưởng)</w:t>
+      </w:r>
+      <w:r>
+        <w:br/>
+      </w:r>
+      <w:r>
+        <w:rPr>
+          <w:rFonts w:ascii="Consolas" w:hAnsi="Consolas"/>
+          <w:color w:val="333333"/>
+          <w:sz w:val="17"/>
+        </w:rPr>
+        <w:t>Kiểm kê định kỳ độc lập ở mỗi địa điểm (location filter riêng)</w:t>
+      </w:r>
+    </w:p>
+    <w:p>
+      <w:pPr>
+        <w:spacing w:before="40"/>
+        <w:ind w:left="280"/>
+      </w:pPr>
+      <w:r>
+        <w:rPr>
+          <w:i/>
+          <w:color w:val="555555"/>
+        </w:rPr>
+        <w:t xml:space="preserve">Xem </w:t>
+      </w:r>
+      <w:r>
+        <w:rPr>
+          <w:b/>
+          <w:i/>
+          <w:color w:val="555555"/>
+        </w:rPr>
+        <w:t>§8.7</w:t>
+      </w:r>
+      <w:r>
+        <w:rPr>
+          <w:i/>
+          <w:color w:val="555555"/>
+        </w:rPr>
+        <w:t xml:space="preserve"> — địa điểm là dữ liệu (chuỗi </w:t>
+      </w:r>
+      <w:r>
+        <w:rPr>
+          <w:rFonts w:ascii="Consolas" w:hAnsi="Consolas"/>
+          <w:i/>
+          <w:color w:val="555555"/>
+          <w:sz w:val="19"/>
+        </w:rPr>
+        <w:t>location</w:t>
+      </w:r>
+      <w:r>
+        <w:rPr>
+          <w:i/>
+          <w:color w:val="555555"/>
+        </w:rPr>
+        <w:t xml:space="preserve">), </w:t>
+      </w:r>
+      <w:r>
+        <w:rPr>
+          <w:b/>
+          <w:i/>
+          <w:color w:val="555555"/>
+        </w:rPr>
+        <w:t>không phải</w:t>
+      </w:r>
+      <w:r>
+        <w:rPr>
+          <w:i/>
+          <w:color w:val="555555"/>
+        </w:rPr>
+        <w:t xml:space="preserve"> một chiều phân quyền riêng.</w:t>
+      </w:r>
+    </w:p>
+    <w:p>
+      <w:pPr>
+        <w:pStyle w:val="Heading3"/>
+      </w:pPr>
+      <w:r>
         <w:t>7.4 Quy tắc bất biến đã thực thi</w:t>
       </w:r>
     </w:p>
@@ -11042,7 +12680,7 @@
     </w:p>
     <w:p>
       <w:r>
-        <w:t xml:space="preserve">Các "chức danh" tài khoản demo (Giám đốc, Quản đốc, Trưởng ca, Vận hành, KCS, Kỹ sư, Thủ kho, Bảo trì, Năng lượng…) </w:t>
+        <w:t xml:space="preserve">Các "chức danh" tài khoản demo (Quản đốc, Phó Quản đốc, Vận hành, KCS, Kỹ sư, Thủ kho, Trưởng phòng KCS, Giám đốc SX-KT, Thủ kho TP…) </w:t>
       </w:r>
       <w:r>
         <w:rPr>
@@ -11089,7 +12727,73 @@
         <w:t>seed.py::_seed_users</w:t>
       </w:r>
       <w:r>
-        <w:t>):</w:t>
+        <w:t>).</w:t>
+      </w:r>
+    </w:p>
+    <w:p>
+      <w:r>
+        <w:rPr>
+          <w:b/>
+        </w:rPr>
+        <w:t>Roster hiện tại căn cứ đúng sơ đồ tổ chức thật 01/2026/SĐTC-BHL</w:t>
+      </w:r>
+      <w:r>
+        <w:t xml:space="preserve"> (thay cho bảng đề xuất cũ) — đã bỏ các chức danh không có riêng trong sơ đồ hoặc trùng vai trò với tài khoản khác: </w:t>
+      </w:r>
+      <w:r>
+        <w:rPr>
+          <w:rFonts w:ascii="Consolas" w:hAnsi="Consolas"/>
+          <w:color w:val="B03A2E"/>
+          <w:sz w:val="19"/>
+        </w:rPr>
+        <w:t>giamdoc</w:t>
+      </w:r>
+      <w:r>
+        <w:t xml:space="preserve"> (chỉ xem chung), </w:t>
+      </w:r>
+      <w:r>
+        <w:rPr>
+          <w:rFonts w:ascii="Consolas" w:hAnsi="Consolas"/>
+          <w:color w:val="B03A2E"/>
+          <w:sz w:val="19"/>
+        </w:rPr>
+        <w:t>truongca</w:t>
+      </w:r>
+      <w:r>
+        <w:t xml:space="preserve">, </w:t>
+      </w:r>
+      <w:r>
+        <w:rPr>
+          <w:rFonts w:ascii="Consolas" w:hAnsi="Consolas"/>
+          <w:color w:val="B03A2E"/>
+          <w:sz w:val="19"/>
+        </w:rPr>
+        <w:t>thukho_px</w:t>
+      </w:r>
+      <w:r>
+        <w:t xml:space="preserve">, </w:t>
+      </w:r>
+      <w:r>
+        <w:rPr>
+          <w:rFonts w:ascii="Consolas" w:hAnsi="Consolas"/>
+          <w:color w:val="B03A2E"/>
+          <w:sz w:val="19"/>
+        </w:rPr>
+        <w:t>baotri</w:t>
+      </w:r>
+      <w:r>
+        <w:t xml:space="preserve">, </w:t>
+      </w:r>
+      <w:r>
+        <w:rPr>
+          <w:rFonts w:ascii="Consolas" w:hAnsi="Consolas"/>
+          <w:color w:val="B03A2E"/>
+          <w:sz w:val="19"/>
+        </w:rPr>
+        <w:t>nangluong</w:t>
+      </w:r>
+      <w:r>
+        <w:t>:</w:t>
       </w:r>
     </w:p>
     <w:tbl>
@@ -11184,7 +12888,7 @@
                 <w:color w:val="FFFFFF"/>
                 <w:sz w:val="19"/>
               </w:rPr>
-              <w:t>Quyền warehouse.*</w:t>
+              <w:t>Quyền chính (permissions)</w:t>
             </w:r>
           </w:p>
         </w:tc>
@@ -11209,7 +12913,7 @@
                 <w:color w:val="FFFFFF"/>
                 <w:sz w:val="19"/>
               </w:rPr>
-              <w:t>Menu kho được thấy</w:t>
+              <w:t>scope_warehouse</w:t>
             </w:r>
           </w:p>
         </w:tc>
@@ -11279,7 +12983,21 @@
               <w:rPr>
                 <w:sz w:val="18"/>
               </w:rPr>
-              <w:t>* (toàn quyền)</w:t>
+              <w:t xml:space="preserve">* (toàn quyền, tạo riêng bởi </w:t>
+            </w:r>
+            <w:r>
+              <w:rPr>
+                <w:rFonts w:ascii="Consolas" w:hAnsi="Consolas"/>
+                <w:color w:val="B03A2E"/>
+                <w:sz w:val="19"/>
+              </w:rPr>
+              <w:t>ensure_admin</w:t>
+            </w:r>
+            <w:r>
+              <w:rPr>
+                <w:sz w:val="18"/>
+              </w:rPr>
+              <w:t>, không trong bảng accounts)</w:t>
             </w:r>
           </w:p>
         </w:tc>
@@ -11301,7 +13019,7 @@
               <w:rPr>
                 <w:sz w:val="18"/>
               </w:rPr>
-              <w:t>tất cả</w:t>
+              <w:t>*</w:t>
             </w:r>
           </w:p>
         </w:tc>
@@ -11328,13 +13046,13 @@
                 <w:color w:val="B03A2E"/>
                 <w:sz w:val="19"/>
               </w:rPr>
-              <w:t>giamdoc</w:t>
-            </w:r>
-            <w:r>
-              <w:rPr>
-                <w:sz w:val="18"/>
-              </w:rPr>
-              <w:t xml:space="preserve"> (Giám đốc)</w:t>
+              <w:t>quandoc</w:t>
+            </w:r>
+            <w:r>
+              <w:rPr>
+                <w:sz w:val="18"/>
+              </w:rPr>
+              <w:t xml:space="preserve"> (Quản đốc phân xưởng)</w:t>
             </w:r>
           </w:p>
         </w:tc>
@@ -11380,7 +13098,7 @@
               <w:rPr>
                 <w:sz w:val="18"/>
               </w:rPr>
-              <w:t>*(không có — chỉ xem)*</w:t>
+              <w:t>master.manage, order.create, wo.manage, wo.dispatch, batch.create, batch.execute, quality.deviation, ebr.sign, ebr.approve, cip.manage</w:t>
             </w:r>
           </w:p>
         </w:tc>
@@ -11403,7 +13121,7 @@
               <w:rPr>
                 <w:sz w:val="18"/>
               </w:rPr>
-              <w:t>không menu kho ghi</w:t>
+              <w:t>*</w:t>
             </w:r>
           </w:p>
         </w:tc>
@@ -11429,13 +13147,13 @@
                 <w:color w:val="B03A2E"/>
                 <w:sz w:val="19"/>
               </w:rPr>
-              <w:t>quandoc</w:t>
-            </w:r>
-            <w:r>
-              <w:rPr>
-                <w:sz w:val="18"/>
-              </w:rPr>
-              <w:t xml:space="preserve"> (Quản đốc PX)</w:t>
+              <w:t>phoquandoc</w:t>
+            </w:r>
+            <w:r>
+              <w:rPr>
+                <w:sz w:val="18"/>
+              </w:rPr>
+              <w:t xml:space="preserve"> (Phó Quản đốc phân xưởng — trực ca)</w:t>
             </w:r>
           </w:p>
         </w:tc>
@@ -11479,7 +13197,21 @@
               <w:rPr>
                 <w:sz w:val="18"/>
               </w:rPr>
-              <w:t>*(không có)*</w:t>
+              <w:t xml:space="preserve">batch.execute, ebr.sign, ebr.approve, quality.deviation, cip.manage. Tài khoản MỚI, thay </w:t>
+            </w:r>
+            <w:r>
+              <w:rPr>
+                <w:rFonts w:ascii="Consolas" w:hAnsi="Consolas"/>
+                <w:color w:val="B03A2E"/>
+                <w:sz w:val="19"/>
+              </w:rPr>
+              <w:t>truongca</w:t>
+            </w:r>
+            <w:r>
+              <w:rPr>
+                <w:sz w:val="18"/>
+              </w:rPr>
+              <w:t xml:space="preserve"> cũ (không có chức danh riêng trong sơ đồ thật)</w:t>
             </w:r>
           </w:p>
         </w:tc>
@@ -11501,7 +13233,7 @@
               <w:rPr>
                 <w:sz w:val="18"/>
               </w:rPr>
-              <w:t>không</w:t>
+              <w:t>*</w:t>
             </w:r>
           </w:p>
         </w:tc>
@@ -11528,13 +13260,13 @@
                 <w:color w:val="B03A2E"/>
                 <w:sz w:val="19"/>
               </w:rPr>
-              <w:t>truongca</w:t>
-            </w:r>
-            <w:r>
-              <w:rPr>
-                <w:sz w:val="18"/>
-              </w:rPr>
-              <w:t xml:space="preserve"> (Trưởng ca SX)</w:t>
+              <w:t>vanhanh</w:t>
+            </w:r>
+            <w:r>
+              <w:rPr>
+                <w:sz w:val="18"/>
+              </w:rPr>
+              <w:t xml:space="preserve"> (Nhân viên vận hành)</w:t>
             </w:r>
           </w:p>
         </w:tc>
@@ -11557,7 +13289,7 @@
               <w:rPr>
                 <w:sz w:val="18"/>
               </w:rPr>
-              <w:t>supervisor</w:t>
+              <w:t>operator</w:t>
             </w:r>
           </w:p>
         </w:tc>
@@ -11578,11 +13310,9 @@
             </w:pPr>
             <w:r>
               <w:rPr>
-                <w:rFonts w:ascii="Consolas" w:hAnsi="Consolas"/>
-                <w:color w:val="B03A2E"/>
-                <w:sz w:val="19"/>
-              </w:rPr>
-              <w:t>warehouse.request</w:t>
+                <w:sz w:val="18"/>
+              </w:rPr>
+              <w:t>batch.execute, ebr.sign, warehouse.request, cip.manage</w:t>
             </w:r>
           </w:p>
         </w:tc>
@@ -11605,7 +13335,7 @@
               <w:rPr>
                 <w:sz w:val="18"/>
               </w:rPr>
-              <w:t>Kho phân xưởng</w:t>
+              <w:t>phan_xuong</w:t>
             </w:r>
           </w:p>
         </w:tc>
@@ -11631,13 +13361,13 @@
                 <w:color w:val="B03A2E"/>
                 <w:sz w:val="19"/>
               </w:rPr>
-              <w:t>vanhanh</w:t>
-            </w:r>
-            <w:r>
-              <w:rPr>
-                <w:sz w:val="18"/>
-              </w:rPr>
-              <w:t xml:space="preserve"> (Vận hành)</w:t>
+              <w:t>kcs</w:t>
+            </w:r>
+            <w:r>
+              <w:rPr>
+                <w:sz w:val="18"/>
+              </w:rPr>
+              <w:t xml:space="preserve"> (Nhân viên KCS/QA)</w:t>
             </w:r>
           </w:p>
         </w:tc>
@@ -11659,7 +13389,7 @@
               <w:rPr>
                 <w:sz w:val="18"/>
               </w:rPr>
-              <w:t>operator</w:t>
+              <w:t>qa</w:t>
             </w:r>
           </w:p>
         </w:tc>
@@ -11679,11 +13409,9 @@
             </w:pPr>
             <w:r>
               <w:rPr>
-                <w:rFonts w:ascii="Consolas" w:hAnsi="Consolas"/>
-                <w:color w:val="B03A2E"/>
-                <w:sz w:val="19"/>
-              </w:rPr>
-              <w:t>warehouse.request</w:t>
+                <w:sz w:val="18"/>
+              </w:rPr>
+              <w:t>quality.release, quality.deviation, recipe.approve, ebr.sign, ebr.approve</w:t>
             </w:r>
           </w:p>
         </w:tc>
@@ -11705,7 +13433,7 @@
               <w:rPr>
                 <w:sz w:val="18"/>
               </w:rPr>
-              <w:t>Kho phân xưởng</w:t>
+              <w:t>*</w:t>
             </w:r>
           </w:p>
         </w:tc>
@@ -11732,13 +13460,13 @@
                 <w:color w:val="B03A2E"/>
                 <w:sz w:val="19"/>
               </w:rPr>
-              <w:t>thukho</w:t>
-            </w:r>
-            <w:r>
-              <w:rPr>
-                <w:sz w:val="18"/>
-              </w:rPr>
-              <w:t xml:space="preserve"> (Thủ kho NVL)</w:t>
+              <w:t>kysu</w:t>
+            </w:r>
+            <w:r>
+              <w:rPr>
+                <w:sz w:val="18"/>
+              </w:rPr>
+              <w:t xml:space="preserve"> (Kỹ sư — P. Kỹ thuật, Công nghệ và Cải tiến Sản xuất)</w:t>
             </w:r>
           </w:p>
         </w:tc>
@@ -11761,7 +13489,7 @@
               <w:rPr>
                 <w:sz w:val="18"/>
               </w:rPr>
-              <w:t>operator</w:t>
+              <w:t>engineer</w:t>
             </w:r>
           </w:p>
         </w:tc>
@@ -11782,25 +13510,30 @@
             </w:pPr>
             <w:r>
               <w:rPr>
+                <w:sz w:val="18"/>
+              </w:rPr>
+              <w:t xml:space="preserve">master.manage, recipe.author, recipe.approve, batch.create, batch.execute, ebr.sign, cip.manage — tài khoản demo </w:t>
+            </w:r>
+            <w:r>
+              <w:rPr>
+                <w:b/>
+                <w:sz w:val="18"/>
+              </w:rPr>
+              <w:t>DUY NHẤT</w:t>
+            </w:r>
+            <w:r>
+              <w:rPr>
+                <w:sz w:val="18"/>
+              </w:rPr>
+              <w:t xml:space="preserve"> giữ </w:t>
+            </w:r>
+            <w:r>
+              <w:rPr>
                 <w:rFonts w:ascii="Consolas" w:hAnsi="Consolas"/>
                 <w:color w:val="B03A2E"/>
                 <w:sz w:val="19"/>
               </w:rPr>
-              <w:t>warehouse.receive</w:t>
-            </w:r>
-            <w:r>
-              <w:rPr>
-                <w:sz w:val="18"/>
-              </w:rPr>
-              <w:t xml:space="preserve">, </w:t>
-            </w:r>
-            <w:r>
-              <w:rPr>
-                <w:rFonts w:ascii="Consolas" w:hAnsi="Consolas"/>
-                <w:color w:val="B03A2E"/>
-                <w:sz w:val="19"/>
-              </w:rPr>
-              <w:t>warehouse.issue</w:t>
+              <w:t>recipe.author</w:t>
             </w:r>
           </w:p>
         </w:tc>
@@ -11823,7 +13556,7 @@
               <w:rPr>
                 <w:sz w:val="18"/>
               </w:rPr>
-              <w:t>Kho công ty</w:t>
+              <w:t>*</w:t>
             </w:r>
           </w:p>
         </w:tc>
@@ -11849,13 +13582,13 @@
                 <w:color w:val="B03A2E"/>
                 <w:sz w:val="19"/>
               </w:rPr>
-              <w:t>thukho_px</w:t>
-            </w:r>
-            <w:r>
-              <w:rPr>
-                <w:sz w:val="18"/>
-              </w:rPr>
-              <w:t xml:space="preserve"> (Thủ kho phân xưởng)</w:t>
+              <w:t>thukho</w:t>
+            </w:r>
+            <w:r>
+              <w:rPr>
+                <w:sz w:val="18"/>
+              </w:rPr>
+              <w:t xml:space="preserve"> (Thủ kho NVL)</w:t>
             </w:r>
           </w:p>
         </w:tc>
@@ -11897,39 +13630,9 @@
             </w:pPr>
             <w:r>
               <w:rPr>
-                <w:rFonts w:ascii="Consolas" w:hAnsi="Consolas"/>
-                <w:color w:val="B03A2E"/>
-                <w:sz w:val="19"/>
-              </w:rPr>
-              <w:t>warehouse.receive</w:t>
-            </w:r>
-            <w:r>
-              <w:rPr>
-                <w:sz w:val="18"/>
-              </w:rPr>
-              <w:t xml:space="preserve">, </w:t>
-            </w:r>
-            <w:r>
-              <w:rPr>
-                <w:rFonts w:ascii="Consolas" w:hAnsi="Consolas"/>
-                <w:color w:val="B03A2E"/>
-                <w:sz w:val="19"/>
-              </w:rPr>
-              <w:t>warehouse.issue</w:t>
-            </w:r>
-            <w:r>
-              <w:rPr>
-                <w:sz w:val="18"/>
-              </w:rPr>
-              <w:t xml:space="preserve">, </w:t>
-            </w:r>
-            <w:r>
-              <w:rPr>
-                <w:rFonts w:ascii="Consolas" w:hAnsi="Consolas"/>
-                <w:color w:val="B03A2E"/>
-                <w:sz w:val="19"/>
-              </w:rPr>
-              <w:t>warehouse.request</w:t>
+                <w:sz w:val="18"/>
+              </w:rPr>
+              <w:t>warehouse.receive, warehouse.issue</w:t>
             </w:r>
           </w:p>
         </w:tc>
@@ -11951,7 +13654,7 @@
               <w:rPr>
                 <w:sz w:val="18"/>
               </w:rPr>
-              <w:t>Kho phân xưởng</w:t>
+              <w:t>cong_ty</w:t>
             </w:r>
           </w:p>
         </w:tc>
@@ -11978,49 +13681,13 @@
                 <w:color w:val="B03A2E"/>
                 <w:sz w:val="19"/>
               </w:rPr>
-              <w:t>kcs</w:t>
-            </w:r>
-            <w:r>
-              <w:rPr>
-                <w:sz w:val="18"/>
-              </w:rPr>
-              <w:t xml:space="preserve">, </w:t>
-            </w:r>
-            <w:r>
-              <w:rPr>
-                <w:rFonts w:ascii="Consolas" w:hAnsi="Consolas"/>
-                <w:color w:val="B03A2E"/>
-                <w:sz w:val="19"/>
-              </w:rPr>
-              <w:t>kysu</w:t>
-            </w:r>
-            <w:r>
-              <w:rPr>
-                <w:sz w:val="18"/>
-              </w:rPr>
-              <w:t xml:space="preserve">, </w:t>
-            </w:r>
-            <w:r>
-              <w:rPr>
-                <w:rFonts w:ascii="Consolas" w:hAnsi="Consolas"/>
-                <w:color w:val="B03A2E"/>
-                <w:sz w:val="19"/>
-              </w:rPr>
-              <w:t>baotri</w:t>
-            </w:r>
-            <w:r>
-              <w:rPr>
-                <w:sz w:val="18"/>
-              </w:rPr>
-              <w:t xml:space="preserve">, </w:t>
-            </w:r>
-            <w:r>
-              <w:rPr>
-                <w:rFonts w:ascii="Consolas" w:hAnsi="Consolas"/>
-                <w:color w:val="B03A2E"/>
-                <w:sz w:val="19"/>
-              </w:rPr>
-              <w:t>nangluong</w:t>
+              <w:t>kcs_truongphong</w:t>
+            </w:r>
+            <w:r>
+              <w:rPr>
+                <w:sz w:val="18"/>
+              </w:rPr>
+              <w:t xml:space="preserve"> (Trưởng phòng KCS)</w:t>
             </w:r>
           </w:p>
         </w:tc>
@@ -12043,7 +13710,7 @@
               <w:rPr>
                 <w:sz w:val="18"/>
               </w:rPr>
-              <w:t>qa/engineer/operator/operator</w:t>
+              <w:t>qa</w:t>
             </w:r>
           </w:p>
         </w:tc>
@@ -12066,7 +13733,20 @@
               <w:rPr>
                 <w:sz w:val="18"/>
               </w:rPr>
-              <w:t>*(không có)*</w:t>
+              <w:t xml:space="preserve">quality.release, quality.deviation, recipe.approve, ebr.sign, ebr.approve, </w:t>
+            </w:r>
+            <w:r>
+              <w:rPr>
+                <w:b/>
+                <w:sz w:val="18"/>
+              </w:rPr>
+              <w:t>order.create</w:t>
+            </w:r>
+            <w:r>
+              <w:rPr>
+                <w:sz w:val="18"/>
+              </w:rPr>
+              <w:t xml:space="preserve"> — khác NV KCS: Trưởng phòng KCS khóa chỉ tiêu VÀ tạo Lệnh lọc, NV KCS chỉ nhập/duyệt theo chỉ tiêu được gán</w:t>
             </w:r>
           </w:p>
         </w:tc>
@@ -12089,7 +13769,256 @@
               <w:rPr>
                 <w:sz w:val="18"/>
               </w:rPr>
-              <w:t>không</w:t>
+              <w:t>*</w:t>
+            </w:r>
+          </w:p>
+        </w:tc>
+      </w:tr>
+      <w:tr>
+        <w:tc>
+          <w:tcPr>
+            <w:tcW w:type="dxa" w:w="2412"/>
+            <w:tcMar>
+              <w:top w:w="60" w:type="dxa"/>
+              <w:bottom w:w="60" w:type="dxa"/>
+              <w:start w:w="110" w:type="dxa"/>
+              <w:end w:w="110" w:type="dxa"/>
+            </w:tcMar>
+          </w:tcPr>
+          <w:p>
+            <w:pPr>
+              <w:spacing w:after="0"/>
+            </w:pPr>
+            <w:r>
+              <w:rPr>
+                <w:rFonts w:ascii="Consolas" w:hAnsi="Consolas"/>
+                <w:color w:val="B03A2E"/>
+                <w:sz w:val="19"/>
+              </w:rPr>
+              <w:t>giamdoc_sx</w:t>
+            </w:r>
+            <w:r>
+              <w:rPr>
+                <w:sz w:val="18"/>
+              </w:rPr>
+              <w:t xml:space="preserve"> (Giám đốc Sản xuất - Kỹ thuật)</w:t>
+            </w:r>
+          </w:p>
+        </w:tc>
+        <w:tc>
+          <w:tcPr>
+            <w:tcW w:type="dxa" w:w="2412"/>
+            <w:tcMar>
+              <w:top w:w="60" w:type="dxa"/>
+              <w:bottom w:w="60" w:type="dxa"/>
+              <w:start w:w="110" w:type="dxa"/>
+              <w:end w:w="110" w:type="dxa"/>
+            </w:tcMar>
+          </w:tcPr>
+          <w:p>
+            <w:pPr>
+              <w:spacing w:after="0"/>
+            </w:pPr>
+            <w:r>
+              <w:rPr>
+                <w:sz w:val="18"/>
+              </w:rPr>
+              <w:t>supervisor</w:t>
+            </w:r>
+          </w:p>
+        </w:tc>
+        <w:tc>
+          <w:tcPr>
+            <w:tcW w:type="dxa" w:w="2412"/>
+            <w:tcMar>
+              <w:top w:w="60" w:type="dxa"/>
+              <w:bottom w:w="60" w:type="dxa"/>
+              <w:start w:w="110" w:type="dxa"/>
+              <w:end w:w="110" w:type="dxa"/>
+            </w:tcMar>
+          </w:tcPr>
+          <w:p>
+            <w:pPr>
+              <w:spacing w:after="0"/>
+            </w:pPr>
+            <w:r>
+              <w:rPr>
+                <w:b/>
+                <w:sz w:val="18"/>
+              </w:rPr>
+              <w:t>production.release_to_wms</w:t>
+            </w:r>
+            <w:r>
+              <w:rPr>
+                <w:sz w:val="18"/>
+              </w:rPr>
+              <w:t xml:space="preserve"> (quyền MỚI, tách khỏi </w:t>
+            </w:r>
+            <w:r>
+              <w:rPr>
+                <w:rFonts w:ascii="Consolas" w:hAnsi="Consolas"/>
+                <w:color w:val="B03A2E"/>
+                <w:sz w:val="19"/>
+              </w:rPr>
+              <w:t>quality.release</w:t>
+            </w:r>
+            <w:r>
+              <w:rPr>
+                <w:sz w:val="18"/>
+              </w:rPr>
+              <w:t xml:space="preserve"> — KCS nhập/khóa chỉ tiêu, Giám đốc SX-KT quyết định duyệt lô chiết cho nhập kho thành phẩm; enforced trong </w:t>
+            </w:r>
+            <w:r>
+              <w:rPr>
+                <w:rFonts w:ascii="Consolas" w:hAnsi="Consolas"/>
+                <w:color w:val="B03A2E"/>
+                <w:sz w:val="19"/>
+              </w:rPr>
+              <w:t>approve_bottle</w:t>
+            </w:r>
+            <w:r>
+              <w:rPr>
+                <w:sz w:val="18"/>
+              </w:rPr>
+              <w:t xml:space="preserve">, </w:t>
+            </w:r>
+            <w:r>
+              <w:rPr>
+                <w:rFonts w:ascii="Consolas" w:hAnsi="Consolas"/>
+                <w:color w:val="B03A2E"/>
+                <w:sz w:val="19"/>
+              </w:rPr>
+              <w:t>routers/brewing.py</w:t>
+            </w:r>
+            <w:r>
+              <w:rPr>
+                <w:sz w:val="18"/>
+              </w:rPr>
+              <w:t>)</w:t>
+            </w:r>
+          </w:p>
+        </w:tc>
+        <w:tc>
+          <w:tcPr>
+            <w:tcW w:type="dxa" w:w="2412"/>
+            <w:tcMar>
+              <w:top w:w="60" w:type="dxa"/>
+              <w:bottom w:w="60" w:type="dxa"/>
+              <w:start w:w="110" w:type="dxa"/>
+              <w:end w:w="110" w:type="dxa"/>
+            </w:tcMar>
+          </w:tcPr>
+          <w:p>
+            <w:pPr>
+              <w:spacing w:after="0"/>
+            </w:pPr>
+            <w:r>
+              <w:rPr>
+                <w:sz w:val="18"/>
+              </w:rPr>
+              <w:t>*</w:t>
+            </w:r>
+          </w:p>
+        </w:tc>
+      </w:tr>
+      <w:tr>
+        <w:tc>
+          <w:tcPr>
+            <w:tcW w:type="dxa" w:w="2412"/>
+            <w:shd w:val="clear" w:color="auto" w:fill="EEF2F8"/>
+            <w:tcMar>
+              <w:top w:w="60" w:type="dxa"/>
+              <w:bottom w:w="60" w:type="dxa"/>
+              <w:start w:w="110" w:type="dxa"/>
+              <w:end w:w="110" w:type="dxa"/>
+            </w:tcMar>
+          </w:tcPr>
+          <w:p>
+            <w:pPr>
+              <w:spacing w:after="0"/>
+            </w:pPr>
+            <w:r>
+              <w:rPr>
+                <w:rFonts w:ascii="Consolas" w:hAnsi="Consolas"/>
+                <w:color w:val="B03A2E"/>
+                <w:sz w:val="19"/>
+              </w:rPr>
+              <w:t>ttdh_thukhotp</w:t>
+            </w:r>
+            <w:r>
+              <w:rPr>
+                <w:sz w:val="18"/>
+              </w:rPr>
+              <w:t xml:space="preserve"> (NV Trung tâm Điều hành - Thủ kho TP)</w:t>
+            </w:r>
+          </w:p>
+        </w:tc>
+        <w:tc>
+          <w:tcPr>
+            <w:tcW w:type="dxa" w:w="2412"/>
+            <w:shd w:val="clear" w:color="auto" w:fill="EEF2F8"/>
+            <w:tcMar>
+              <w:top w:w="60" w:type="dxa"/>
+              <w:bottom w:w="60" w:type="dxa"/>
+              <w:start w:w="110" w:type="dxa"/>
+              <w:end w:w="110" w:type="dxa"/>
+            </w:tcMar>
+          </w:tcPr>
+          <w:p>
+            <w:pPr>
+              <w:spacing w:after="0"/>
+            </w:pPr>
+            <w:r>
+              <w:rPr>
+                <w:sz w:val="18"/>
+              </w:rPr>
+              <w:t>operator</w:t>
+            </w:r>
+          </w:p>
+        </w:tc>
+        <w:tc>
+          <w:tcPr>
+            <w:tcW w:type="dxa" w:w="2412"/>
+            <w:shd w:val="clear" w:color="auto" w:fill="EEF2F8"/>
+            <w:tcMar>
+              <w:top w:w="60" w:type="dxa"/>
+              <w:bottom w:w="60" w:type="dxa"/>
+              <w:start w:w="110" w:type="dxa"/>
+              <w:end w:w="110" w:type="dxa"/>
+            </w:tcMar>
+          </w:tcPr>
+          <w:p>
+            <w:pPr>
+              <w:spacing w:after="0"/>
+            </w:pPr>
+            <w:r>
+              <w:rPr>
+                <w:sz w:val="18"/>
+              </w:rPr>
+              <w:t>warehouse.receive, warehouse.issue (quản lý kho thành phẩm: xuất kho, điều chuyển, nhập bia cận date)</w:t>
+            </w:r>
+          </w:p>
+        </w:tc>
+        <w:tc>
+          <w:tcPr>
+            <w:tcW w:type="dxa" w:w="2412"/>
+            <w:shd w:val="clear" w:color="auto" w:fill="EEF2F8"/>
+            <w:tcMar>
+              <w:top w:w="60" w:type="dxa"/>
+              <w:bottom w:w="60" w:type="dxa"/>
+              <w:start w:w="110" w:type="dxa"/>
+              <w:end w:w="110" w:type="dxa"/>
+            </w:tcMar>
+          </w:tcPr>
+          <w:p>
+            <w:pPr>
+              <w:spacing w:after="0"/>
+            </w:pPr>
+            <w:r>
+              <w:rPr>
+                <w:sz w:val="18"/>
+              </w:rPr>
+              <w:t>*</w:t>
             </w:r>
           </w:p>
         </w:tc>
@@ -12112,14 +14041,14 @@
           <w:color w:val="555555"/>
           <w:sz w:val="19"/>
         </w:rPr>
-        <w:t>truongca</w:t>
+        <w:t>vanhanh</w:t>
       </w:r>
       <w:r>
         <w:rPr>
           <w:i/>
           <w:color w:val="555555"/>
         </w:rPr>
-        <w:t>/</w:t>
+        <w:t xml:space="preserve"> chỉ có </w:t>
       </w:r>
       <w:r>
         <w:rPr>
@@ -12128,14 +14057,29 @@
           <w:color w:val="555555"/>
           <w:sz w:val="19"/>
         </w:rPr>
-        <w:t>vanhanh</w:t>
+        <w:t>warehouse.request</w:t>
       </w:r>
       <w:r>
         <w:rPr>
           <w:i/>
           <w:color w:val="555555"/>
         </w:rPr>
-        <w:t xml:space="preserve"> chỉ có </w:t>
+        <w:t xml:space="preserve"> (tạo đề nghị nhận kho) — </w:t>
+      </w:r>
+      <w:r>
+        <w:rPr>
+          <w:b/>
+          <w:i/>
+          <w:color w:val="555555"/>
+        </w:rPr>
+        <w:t>không</w:t>
+      </w:r>
+      <w:r>
+        <w:rPr>
+          <w:i/>
+          <w:color w:val="555555"/>
+        </w:rPr>
+        <w:t xml:space="preserve"> có </w:t>
       </w:r>
       <w:r>
         <w:rPr>
@@ -12144,29 +14088,14 @@
           <w:color w:val="555555"/>
           <w:sz w:val="19"/>
         </w:rPr>
-        <w:t>warehouse.request</w:t>
+        <w:t>warehouse.receive</w:t>
       </w:r>
       <w:r>
         <w:rPr>
           <w:i/>
           <w:color w:val="555555"/>
         </w:rPr>
-        <w:t xml:space="preserve"> (tạo đề nghị nhận kho) — </w:t>
-      </w:r>
-      <w:r>
-        <w:rPr>
-          <w:b/>
-          <w:i/>
-          <w:color w:val="555555"/>
-        </w:rPr>
-        <w:t>không</w:t>
-      </w:r>
-      <w:r>
-        <w:rPr>
-          <w:i/>
-          <w:color w:val="555555"/>
-        </w:rPr>
-        <w:t xml:space="preserve"> có </w:t>
+        <w:t>/</w:t>
       </w:r>
       <w:r>
         <w:rPr>
@@ -12175,14 +14104,14 @@
           <w:color w:val="555555"/>
           <w:sz w:val="19"/>
         </w:rPr>
-        <w:t>warehouse.receive</w:t>
+        <w:t>issue</w:t>
       </w:r>
       <w:r>
         <w:rPr>
           <w:i/>
           <w:color w:val="555555"/>
         </w:rPr>
-        <w:t>/</w:t>
+        <w:t xml:space="preserve">, nên không tự nhập/xuất trực tiếp NVL tại Kho phân xưởng được. Roster hiện không còn tài khoản "Thủ kho phân xưởng" riêng (đã bỏ </w:t>
       </w:r>
       <w:r>
         <w:rPr>
@@ -12191,14 +14120,14 @@
           <w:color w:val="555555"/>
           <w:sz w:val="19"/>
         </w:rPr>
-        <w:t>issue</w:t>
+        <w:t>thukho_px</w:t>
       </w:r>
       <w:r>
         <w:rPr>
           <w:i/>
           <w:color w:val="555555"/>
         </w:rPr>
-        <w:t xml:space="preserve">, nên không tự nhập/xuất trực tiếp tại Kho phân xưởng được; </w:t>
+        <w:t xml:space="preserve">, không có trong sơ đồ thật) — chỉ </w:t>
       </w:r>
       <w:r>
         <w:rPr>
@@ -12207,14 +14136,14 @@
           <w:color w:val="555555"/>
           <w:sz w:val="19"/>
         </w:rPr>
-        <w:t>thukho_px</w:t>
+        <w:t>thukho</w:t>
       </w:r>
       <w:r>
         <w:rPr>
           <w:i/>
           <w:color w:val="555555"/>
         </w:rPr>
-        <w:t xml:space="preserve"> là tài khoản thao tác trực tiếp tương ứng phía phân xưởng (đối xứng với </w:t>
+        <w:t xml:space="preserve"> (Kho công ty NVL) và </w:t>
       </w:r>
       <w:r>
         <w:rPr>
@@ -12223,14 +14152,46 @@
           <w:color w:val="555555"/>
           <w:sz w:val="19"/>
         </w:rPr>
-        <w:t>thukho</w:t>
+        <w:t>ttdh_thukhotp</w:t>
       </w:r>
       <w:r>
         <w:rPr>
           <w:i/>
           <w:color w:val="555555"/>
         </w:rPr>
-        <w:t xml:space="preserve"> phía công ty), phân biệt bằng </w:t>
+        <w:t xml:space="preserve"> (Kho thành phẩm) có </w:t>
+      </w:r>
+      <w:r>
+        <w:rPr>
+          <w:rFonts w:ascii="Consolas" w:hAnsi="Consolas"/>
+          <w:i/>
+          <w:color w:val="555555"/>
+          <w:sz w:val="19"/>
+        </w:rPr>
+        <w:t>warehouse.receive</w:t>
+      </w:r>
+      <w:r>
+        <w:rPr>
+          <w:i/>
+          <w:color w:val="555555"/>
+        </w:rPr>
+        <w:t>/</w:t>
+      </w:r>
+      <w:r>
+        <w:rPr>
+          <w:rFonts w:ascii="Consolas" w:hAnsi="Consolas"/>
+          <w:i/>
+          <w:color w:val="555555"/>
+          <w:sz w:val="19"/>
+        </w:rPr>
+        <w:t>issue</w:t>
+      </w:r>
+      <w:r>
+        <w:rPr>
+          <w:i/>
+          <w:color w:val="555555"/>
+        </w:rPr>
+        <w:t xml:space="preserve">, phân biệt bằng </w:t>
       </w:r>
       <w:r>
         <w:rPr>
@@ -12384,7 +14345,7 @@
         <w:pStyle w:val="Heading3"/>
       </w:pPr>
       <w:r>
-        <w:t>8.3 Catalog quyền thao tác (permission) — 21 quyền, áp ở tầng router/service (require_perm)</w:t>
+        <w:t>8.3 Catalog quyền thao tác (permission) — 23 quyền, áp ở tầng router/service (require_perm)</w:t>
       </w:r>
     </w:p>
     <w:p>
@@ -12504,7 +14465,7 @@
           <w:color w:val="B03A2E"/>
           <w:sz w:val="19"/>
         </w:rPr>
-        <w:t>ebr.sign</w:t>
+        <w:t>production.release_to_wms</w:t>
       </w:r>
       <w:r>
         <w:t xml:space="preserve"> · </w:t>
@@ -12515,7 +14476,7 @@
           <w:color w:val="B03A2E"/>
           <w:sz w:val="19"/>
         </w:rPr>
-        <w:t>ebr.approve</w:t>
+        <w:t>ebr.sign</w:t>
       </w:r>
       <w:r>
         <w:t xml:space="preserve"> · </w:t>
@@ -12526,7 +14487,7 @@
           <w:color w:val="B03A2E"/>
           <w:sz w:val="19"/>
         </w:rPr>
-        <w:t>warehouse.receive</w:t>
+        <w:t>ebr.approve</w:t>
       </w:r>
       <w:r>
         <w:t xml:space="preserve"> · </w:t>
@@ -12537,7 +14498,7 @@
           <w:color w:val="B03A2E"/>
           <w:sz w:val="19"/>
         </w:rPr>
-        <w:t>warehouse.issue</w:t>
+        <w:t>warehouse.receive</w:t>
       </w:r>
       <w:r>
         <w:t xml:space="preserve"> · </w:t>
@@ -12548,7 +14509,7 @@
           <w:color w:val="B03A2E"/>
           <w:sz w:val="19"/>
         </w:rPr>
-        <w:t>warehouse.request</w:t>
+        <w:t>warehouse.issue</w:t>
       </w:r>
       <w:r>
         <w:t xml:space="preserve"> · </w:t>
@@ -12559,7 +14520,7 @@
           <w:color w:val="B03A2E"/>
           <w:sz w:val="19"/>
         </w:rPr>
-        <w:t>maintenance.manage</w:t>
+        <w:t>warehouse.request</w:t>
       </w:r>
       <w:r>
         <w:t xml:space="preserve"> · </w:t>
@@ -12570,7 +14531,7 @@
           <w:color w:val="B03A2E"/>
           <w:sz w:val="19"/>
         </w:rPr>
-        <w:t>calibration.manage</w:t>
+        <w:t>maintenance.manage</w:t>
       </w:r>
       <w:r>
         <w:t xml:space="preserve"> · </w:t>
@@ -12581,7 +14542,7 @@
           <w:color w:val="B03A2E"/>
           <w:sz w:val="19"/>
         </w:rPr>
-        <w:t>energy.update</w:t>
+        <w:t>calibration.manage</w:t>
       </w:r>
       <w:r>
         <w:t xml:space="preserve"> · </w:t>
@@ -12592,7 +14553,7 @@
           <w:color w:val="B03A2E"/>
           <w:sz w:val="19"/>
         </w:rPr>
-        <w:t>user.manage</w:t>
+        <w:t>energy.update</w:t>
       </w:r>
       <w:r>
         <w:t xml:space="preserve"> · </w:t>
@@ -12603,7 +14564,7 @@
           <w:color w:val="B03A2E"/>
           <w:sz w:val="19"/>
         </w:rPr>
-        <w:t>integration.manage</w:t>
+        <w:t>user.manage</w:t>
       </w:r>
       <w:r>
         <w:t xml:space="preserve"> · </w:t>
@@ -12614,10 +14575,70 @@
           <w:color w:val="B03A2E"/>
           <w:sz w:val="19"/>
         </w:rPr>
+        <w:t>integration.manage</w:t>
+      </w:r>
+      <w:r>
+        <w:t xml:space="preserve"> · </w:t>
+      </w:r>
+      <w:r>
+        <w:rPr>
+          <w:rFonts w:ascii="Consolas" w:hAnsi="Consolas"/>
+          <w:color w:val="B03A2E"/>
+          <w:sz w:val="19"/>
+        </w:rPr>
         <w:t>integration.import</w:t>
       </w:r>
       <w:r>
+        <w:t xml:space="preserve"> · </w:t>
+      </w:r>
+      <w:r>
+        <w:rPr>
+          <w:rFonts w:ascii="Consolas" w:hAnsi="Consolas"/>
+          <w:color w:val="B03A2E"/>
+          <w:sz w:val="19"/>
+        </w:rPr>
+        <w:t>cip.manage</w:t>
+      </w:r>
+      <w:r>
         <w:t>.</w:t>
+      </w:r>
+    </w:p>
+    <w:p>
+      <w:r>
+        <w:t xml:space="preserve">Hai quyền mới thêm so với bản trước (21 quyền): </w:t>
+      </w:r>
+      <w:r>
+        <w:rPr>
+          <w:rFonts w:ascii="Consolas" w:hAnsi="Consolas"/>
+          <w:color w:val="B03A2E"/>
+          <w:sz w:val="19"/>
+        </w:rPr>
+        <w:t>production.release_to_wms</w:t>
+      </w:r>
+      <w:r>
+        <w:t xml:space="preserve"> (Giám đốc/Phó GĐ Sản xuất - Kỹ thuật duyệt lô chiết nhập kho thành phẩm, tách khỏi </w:t>
+      </w:r>
+      <w:r>
+        <w:rPr>
+          <w:rFonts w:ascii="Consolas" w:hAnsi="Consolas"/>
+          <w:color w:val="B03A2E"/>
+          <w:sz w:val="19"/>
+        </w:rPr>
+        <w:t>quality.release</w:t>
+      </w:r>
+      <w:r>
+        <w:t xml:space="preserve">) và </w:t>
+      </w:r>
+      <w:r>
+        <w:rPr>
+          <w:rFonts w:ascii="Consolas" w:hAnsi="Consolas"/>
+          <w:color w:val="B03A2E"/>
+          <w:sz w:val="19"/>
+        </w:rPr>
+        <w:t>cip.manage</w:t>
+      </w:r>
+      <w:r>
+        <w:t xml:space="preserve"> (khai báo/thao tác vệ sinh CIP — xem §5.14).</w:t>
       </w:r>
     </w:p>
     <w:p>
@@ -12711,7 +14732,60 @@
         <w:t>`scope_qc`</w:t>
       </w:r>
       <w:r>
-        <w:t xml:space="preserve"> — loại test QC: chặn KCS ghi parameter ngoài phạm vi.</w:t>
+        <w:t xml:space="preserve"> — loại test QC: chặn KCS ghi parameter ngoài phạm vi. Danh sách "Loại chỉ tiêu QC" trong scope-picker (khi phân quyền tài khoản) nay lấy từ </w:t>
+      </w:r>
+      <w:r>
+        <w:rPr>
+          <w:b/>
+        </w:rPr>
+        <w:t>Danh mục chỉ tiêu</w:t>
+      </w:r>
+      <w:r>
+        <w:t xml:space="preserve"> (</w:t>
+      </w:r>
+      <w:r>
+        <w:rPr>
+          <w:rFonts w:ascii="Consolas" w:hAnsi="Consolas"/>
+          <w:color w:val="B03A2E"/>
+          <w:sz w:val="19"/>
+        </w:rPr>
+        <w:t>QCParameter</w:t>
+      </w:r>
+      <w:r>
+        <w:t xml:space="preserve">, </w:t>
+      </w:r>
+      <w:r>
+        <w:rPr>
+          <w:rFonts w:ascii="Consolas" w:hAnsi="Consolas"/>
+          <w:color w:val="B03A2E"/>
+          <w:sz w:val="19"/>
+        </w:rPr>
+        <w:t>active=True</w:t>
+      </w:r>
+      <w:r>
+        <w:t xml:space="preserve">) thay vì chỉ liệt kê chỉ tiêu ĐÃ có kết quả ghi nhận trong </w:t>
+      </w:r>
+      <w:r>
+        <w:rPr>
+          <w:rFonts w:ascii="Consolas" w:hAnsi="Consolas"/>
+          <w:color w:val="B03A2E"/>
+          <w:sz w:val="19"/>
+        </w:rPr>
+        <w:t>QualityResult</w:t>
+      </w:r>
+      <w:r>
+        <w:t xml:space="preserve"> — tránh thiếu chỉ tiêu mới chưa ai ghi kết quả (gộp thêm mã cũ trong </w:t>
+      </w:r>
+      <w:r>
+        <w:rPr>
+          <w:rFonts w:ascii="Consolas" w:hAnsi="Consolas"/>
+          <w:color w:val="B03A2E"/>
+          <w:sz w:val="19"/>
+        </w:rPr>
+        <w:t>QualityResult</w:t>
+      </w:r>
+      <w:r>
+        <w:t xml:space="preserve"> không còn trong Danh mục để không mất scope đã gán cho tài khoản từ trước).</w:t>
       </w:r>
     </w:p>
     <w:p>
@@ -12833,6 +14907,104 @@
       </w:r>
     </w:p>
     <w:p>
+      <w:r>
+        <w:t xml:space="preserve">Tab Audit trail (frontend) nay thêm </w:t>
+      </w:r>
+      <w:r>
+        <w:rPr>
+          <w:b/>
+        </w:rPr>
+        <w:t>cột "Module" đầu bảng</w:t>
+      </w:r>
+      <w:r>
+        <w:t xml:space="preserve"> — ánh xạ </w:t>
+      </w:r>
+      <w:r>
+        <w:rPr>
+          <w:rFonts w:ascii="Consolas" w:hAnsi="Consolas"/>
+          <w:color w:val="B03A2E"/>
+          <w:sz w:val="19"/>
+        </w:rPr>
+        <w:t>entity_type</w:t>
+      </w:r>
+      <w:r>
+        <w:t xml:space="preserve"> → tên module trên thanh menu chính (VD </w:t>
+      </w:r>
+      <w:r>
+        <w:rPr>
+          <w:rFonts w:ascii="Consolas" w:hAnsi="Consolas"/>
+          <w:color w:val="B03A2E"/>
+          <w:sz w:val="19"/>
+        </w:rPr>
+        <w:t>finished_goods_unit</w:t>
+      </w:r>
+      <w:r>
+        <w:t xml:space="preserve"> → "Kho TP (WMS)", </w:t>
+      </w:r>
+      <w:r>
+        <w:rPr>
+          <w:rFonts w:ascii="Consolas" w:hAnsi="Consolas"/>
+          <w:color w:val="B03A2E"/>
+          <w:sz w:val="19"/>
+        </w:rPr>
+        <w:t>cip_record</w:t>
+      </w:r>
+      <w:r>
+        <w:t xml:space="preserve"> → "CIP", </w:t>
+      </w:r>
+      <w:r>
+        <w:rPr>
+          <w:rFonts w:ascii="Consolas" w:hAnsi="Consolas"/>
+          <w:color w:val="B03A2E"/>
+          <w:sz w:val="19"/>
+        </w:rPr>
+        <w:t>finished_product</w:t>
+      </w:r>
+      <w:r>
+        <w:t xml:space="preserve"> → "Danh mục") để biết 1 dòng audit thuộc phân hệ nào mà không cần đoán qua mã kỹ thuật. Nút </w:t>
+      </w:r>
+      <w:r>
+        <w:rPr>
+          <w:b/>
+        </w:rPr>
+        <w:t>"Xem chi tiết"</w:t>
+      </w:r>
+      <w:r>
+        <w:t xml:space="preserve"> mở modal so sánh </w:t>
+      </w:r>
+      <w:r>
+        <w:rPr>
+          <w:b/>
+        </w:rPr>
+        <w:t>diff trước/sau theo từng trường</w:t>
+      </w:r>
+      <w:r>
+        <w:t xml:space="preserve">, dịch </w:t>
+      </w:r>
+      <w:r>
+        <w:rPr>
+          <w:rFonts w:ascii="Consolas" w:hAnsi="Consolas"/>
+          <w:color w:val="B03A2E"/>
+          <w:sz w:val="19"/>
+        </w:rPr>
+        <w:t>entity_type</w:t>
+      </w:r>
+      <w:r>
+        <w:t>/</w:t>
+      </w:r>
+      <w:r>
+        <w:rPr>
+          <w:rFonts w:ascii="Consolas" w:hAnsi="Consolas"/>
+          <w:color w:val="B03A2E"/>
+          <w:sz w:val="19"/>
+        </w:rPr>
+        <w:t>action</w:t>
+      </w:r>
+      <w:r>
+        <w:t>/tên trường sang tiếng Việt (kèm mã gốc để đối chiếu, tự "làm đẹp" field lạ chưa có trong từ điển) — thay vì chỉ hiện JSON thô như trước.</w:t>
+      </w:r>
+    </w:p>
+    <w:p>
       <w:pPr>
         <w:pStyle w:val="Heading3"/>
       </w:pPr>
@@ -13388,10 +15560,10 @@
           <w:color w:val="B03A2E"/>
           <w:sz w:val="19"/>
         </w:rPr>
-        <w:t>thukho_px</w:t>
-      </w:r>
-      <w:r>
-        <w:t xml:space="preserve">, </w:t>
+        <w:t>vanhanh</w:t>
+      </w:r>
+      <w:r>
+        <w:t xml:space="preserve"> → </w:t>
       </w:r>
       <w:r>
         <w:rPr>
@@ -13399,10 +15571,10 @@
           <w:color w:val="B03A2E"/>
           <w:sz w:val="19"/>
         </w:rPr>
-        <w:t>truongca</w:t>
-      </w:r>
-      <w:r>
-        <w:t xml:space="preserve">, </w:t>
+        <w:t>"phan_xuong"</w:t>
+      </w:r>
+      <w:r>
+        <w:t>; các tài khoản còn lại (</w:t>
       </w:r>
       <w:r>
         <w:rPr>
@@ -13410,10 +15582,10 @@
           <w:color w:val="B03A2E"/>
           <w:sz w:val="19"/>
         </w:rPr>
-        <w:t>vanhanh</w:t>
-      </w:r>
-      <w:r>
-        <w:t xml:space="preserve"> → </w:t>
+        <w:t>quandoc</w:t>
+      </w:r>
+      <w:r>
+        <w:t xml:space="preserve">, </w:t>
       </w:r>
       <w:r>
         <w:rPr>
@@ -13421,10 +15593,10 @@
           <w:color w:val="B03A2E"/>
           <w:sz w:val="19"/>
         </w:rPr>
-        <w:t>"phan_xuong"</w:t>
-      </w:r>
-      <w:r>
-        <w:t xml:space="preserve">; các tài khoản còn lại → </w:t>
+        <w:t>phoquandoc</w:t>
+      </w:r>
+      <w:r>
+        <w:t xml:space="preserve">, </w:t>
       </w:r>
       <w:r>
         <w:rPr>
@@ -13432,10 +15604,76 @@
           <w:color w:val="B03A2E"/>
           <w:sz w:val="19"/>
         </w:rPr>
+        <w:t>kcs</w:t>
+      </w:r>
+      <w:r>
+        <w:t xml:space="preserve">, </w:t>
+      </w:r>
+      <w:r>
+        <w:rPr>
+          <w:rFonts w:ascii="Consolas" w:hAnsi="Consolas"/>
+          <w:color w:val="B03A2E"/>
+          <w:sz w:val="19"/>
+        </w:rPr>
+        <w:t>kysu</w:t>
+      </w:r>
+      <w:r>
+        <w:t xml:space="preserve">, </w:t>
+      </w:r>
+      <w:r>
+        <w:rPr>
+          <w:rFonts w:ascii="Consolas" w:hAnsi="Consolas"/>
+          <w:color w:val="B03A2E"/>
+          <w:sz w:val="19"/>
+        </w:rPr>
+        <w:t>kcs_truongphong</w:t>
+      </w:r>
+      <w:r>
+        <w:t xml:space="preserve">, </w:t>
+      </w:r>
+      <w:r>
+        <w:rPr>
+          <w:rFonts w:ascii="Consolas" w:hAnsi="Consolas"/>
+          <w:color w:val="B03A2E"/>
+          <w:sz w:val="19"/>
+        </w:rPr>
+        <w:t>giamdoc_sx</w:t>
+      </w:r>
+      <w:r>
+        <w:t xml:space="preserve">, </w:t>
+      </w:r>
+      <w:r>
+        <w:rPr>
+          <w:rFonts w:ascii="Consolas" w:hAnsi="Consolas"/>
+          <w:color w:val="B03A2E"/>
+          <w:sz w:val="19"/>
+        </w:rPr>
+        <w:t>ttdh_thukhotp</w:t>
+      </w:r>
+      <w:r>
+        <w:t xml:space="preserve">) → </w:t>
+      </w:r>
+      <w:r>
+        <w:rPr>
+          <w:rFonts w:ascii="Consolas" w:hAnsi="Consolas"/>
+          <w:color w:val="B03A2E"/>
+          <w:sz w:val="19"/>
+        </w:rPr>
         <w:t>"*"</w:t>
       </w:r>
       <w:r>
-        <w:t xml:space="preserve"> (không giới hạn, vì không thao tác kho trực tiếp).</w:t>
+        <w:t xml:space="preserve"> (không giới hạn — </w:t>
+      </w:r>
+      <w:r>
+        <w:rPr>
+          <w:rFonts w:ascii="Consolas" w:hAnsi="Consolas"/>
+          <w:color w:val="B03A2E"/>
+          <w:sz w:val="19"/>
+        </w:rPr>
+        <w:t>ttdh_thukhotp</w:t>
+      </w:r>
+      <w:r>
+        <w:t xml:space="preserve"> thao tác kho thành phẩm/WMS, không phải kho NVL công ty/phân xưởng nên không dùng chiều scope này).</w:t>
       </w:r>
     </w:p>
     <w:p>

</xml_diff>